<commit_message>
Other Payment Entry Edit Add
</commit_message>
<xml_diff>
--- a/src/HotelRestaurant.Infrastructure/SQL/MasterDataa.docx
+++ b/src/HotelRestaurant.Infrastructure/SQL/MasterDataa.docx
@@ -34,6 +34,7 @@
         </w:rPr>
         <w:t>. Tax Management (</w:t>
       </w:r>
+      <w:proofErr w:type="spellStart"/>
       <w:r>
         <w:rPr>
           <w:rFonts w:ascii="Nirmala UI" w:eastAsia="Times New Roman" w:hAnsi="Nirmala UI" w:cs="Nirmala UI"/>
@@ -44,6 +45,7 @@
         </w:rPr>
         <w:t>ট্যাক্স</w:t>
       </w:r>
+      <w:proofErr w:type="spellEnd"/>
       <w:r>
         <w:rPr>
           <w:rFonts w:ascii="Times New Roman" w:eastAsia="Times New Roman" w:hAnsi="Times New Roman" w:cs="Times New Roman"/>
@@ -54,6 +56,7 @@
         </w:rPr>
         <w:t xml:space="preserve"> </w:t>
       </w:r>
+      <w:proofErr w:type="spellStart"/>
       <w:r>
         <w:rPr>
           <w:rFonts w:ascii="Nirmala UI" w:eastAsia="Times New Roman" w:hAnsi="Nirmala UI" w:cs="Nirmala UI"/>
@@ -64,6 +67,7 @@
         </w:rPr>
         <w:t>এন্ট্রি</w:t>
       </w:r>
+      <w:proofErr w:type="spellEnd"/>
       <w:r>
         <w:rPr>
           <w:rFonts w:ascii="Times New Roman" w:eastAsia="Times New Roman" w:hAnsi="Times New Roman" w:cs="Times New Roman"/>
@@ -680,6 +684,7 @@
         </w:rPr>
         <w:t xml:space="preserve"> Promo Code / Coupon Matrix (</w:t>
       </w:r>
+      <w:proofErr w:type="spellStart"/>
       <w:r>
         <w:rPr>
           <w:rFonts w:ascii="Nirmala UI" w:eastAsia="Times New Roman" w:hAnsi="Nirmala UI" w:cs="Nirmala UI"/>
@@ -690,6 +695,7 @@
         </w:rPr>
         <w:t>প্রোমো</w:t>
       </w:r>
+      <w:proofErr w:type="spellEnd"/>
       <w:r>
         <w:rPr>
           <w:rFonts w:ascii="Times New Roman" w:eastAsia="Times New Roman" w:hAnsi="Times New Roman" w:cs="Times New Roman"/>
@@ -700,6 +706,7 @@
         </w:rPr>
         <w:t xml:space="preserve"> </w:t>
       </w:r>
+      <w:proofErr w:type="spellStart"/>
       <w:r>
         <w:rPr>
           <w:rFonts w:ascii="Nirmala UI" w:eastAsia="Times New Roman" w:hAnsi="Nirmala UI" w:cs="Nirmala UI"/>
@@ -710,6 +717,7 @@
         </w:rPr>
         <w:t>কোড</w:t>
       </w:r>
+      <w:proofErr w:type="spellEnd"/>
       <w:r>
         <w:rPr>
           <w:rFonts w:ascii="Times New Roman" w:eastAsia="Times New Roman" w:hAnsi="Times New Roman" w:cs="Times New Roman"/>
@@ -730,6 +738,7 @@
           <w:szCs w:val="24"/>
         </w:rPr>
       </w:pPr>
+      <w:proofErr w:type="spellStart"/>
       <w:r>
         <w:rPr>
           <w:rFonts w:ascii="Nirmala UI" w:eastAsia="Times New Roman" w:hAnsi="Nirmala UI" w:cs="Nirmala UI"/>
@@ -740,6 +749,7 @@
         </w:rPr>
         <w:t>নোট</w:t>
       </w:r>
+      <w:proofErr w:type="spellEnd"/>
       <w:r>
         <w:rPr>
           <w:rFonts w:ascii="Times New Roman" w:eastAsia="Times New Roman" w:hAnsi="Times New Roman" w:cs="Times New Roman"/>
@@ -750,6 +760,7 @@
         </w:rPr>
         <w:t xml:space="preserve">: Start Date </w:t>
       </w:r>
+      <w:proofErr w:type="spellStart"/>
       <w:r>
         <w:rPr>
           <w:rFonts w:ascii="Nirmala UI" w:eastAsia="Times New Roman" w:hAnsi="Nirmala UI" w:cs="Nirmala UI"/>
@@ -760,6 +771,7 @@
         </w:rPr>
         <w:t>এবং</w:t>
       </w:r>
+      <w:proofErr w:type="spellEnd"/>
       <w:r>
         <w:rPr>
           <w:rFonts w:ascii="Times New Roman" w:eastAsia="Times New Roman" w:hAnsi="Times New Roman" w:cs="Times New Roman"/>
@@ -770,6 +782,7 @@
         </w:rPr>
         <w:t xml:space="preserve"> End Date </w:t>
       </w:r>
+      <w:proofErr w:type="spellStart"/>
       <w:r>
         <w:rPr>
           <w:rFonts w:ascii="Nirmala UI" w:eastAsia="Times New Roman" w:hAnsi="Nirmala UI" w:cs="Nirmala UI"/>
@@ -780,16 +793,18 @@
         </w:rPr>
         <w:t>আপনার</w:t>
       </w:r>
-      <w:r>
-        <w:rPr>
-          <w:rFonts w:ascii="Times New Roman" w:eastAsia="Times New Roman" w:hAnsi="Times New Roman" w:cs="Times New Roman"/>
-          <w:i/>
-          <w:iCs/>
-          <w:sz w:val="24"/>
-          <w:szCs w:val="24"/>
-        </w:rPr>
-        <w:t xml:space="preserve"> </w:t>
-      </w:r>
+      <w:proofErr w:type="spellEnd"/>
+      <w:r>
+        <w:rPr>
+          <w:rFonts w:ascii="Times New Roman" w:eastAsia="Times New Roman" w:hAnsi="Times New Roman" w:cs="Times New Roman"/>
+          <w:i/>
+          <w:iCs/>
+          <w:sz w:val="24"/>
+          <w:szCs w:val="24"/>
+        </w:rPr>
+        <w:t xml:space="preserve"> </w:t>
+      </w:r>
+      <w:proofErr w:type="spellStart"/>
       <w:r>
         <w:rPr>
           <w:rFonts w:ascii="Nirmala UI" w:eastAsia="Times New Roman" w:hAnsi="Nirmala UI" w:cs="Nirmala UI"/>
@@ -800,16 +815,18 @@
         </w:rPr>
         <w:t>বর্তমান</w:t>
       </w:r>
-      <w:r>
-        <w:rPr>
-          <w:rFonts w:ascii="Times New Roman" w:eastAsia="Times New Roman" w:hAnsi="Times New Roman" w:cs="Times New Roman"/>
-          <w:i/>
-          <w:iCs/>
-          <w:sz w:val="24"/>
-          <w:szCs w:val="24"/>
-        </w:rPr>
-        <w:t xml:space="preserve"> </w:t>
-      </w:r>
+      <w:proofErr w:type="spellEnd"/>
+      <w:r>
+        <w:rPr>
+          <w:rFonts w:ascii="Times New Roman" w:eastAsia="Times New Roman" w:hAnsi="Times New Roman" w:cs="Times New Roman"/>
+          <w:i/>
+          <w:iCs/>
+          <w:sz w:val="24"/>
+          <w:szCs w:val="24"/>
+        </w:rPr>
+        <w:t xml:space="preserve"> </w:t>
+      </w:r>
+      <w:proofErr w:type="spellStart"/>
       <w:r>
         <w:rPr>
           <w:rFonts w:ascii="Nirmala UI" w:eastAsia="Times New Roman" w:hAnsi="Nirmala UI" w:cs="Nirmala UI"/>
@@ -820,16 +837,18 @@
         </w:rPr>
         <w:t>বা</w:t>
       </w:r>
-      <w:r>
-        <w:rPr>
-          <w:rFonts w:ascii="Times New Roman" w:eastAsia="Times New Roman" w:hAnsi="Times New Roman" w:cs="Times New Roman"/>
-          <w:i/>
-          <w:iCs/>
-          <w:sz w:val="24"/>
-          <w:szCs w:val="24"/>
-        </w:rPr>
-        <w:t xml:space="preserve"> </w:t>
-      </w:r>
+      <w:proofErr w:type="spellEnd"/>
+      <w:r>
+        <w:rPr>
+          <w:rFonts w:ascii="Times New Roman" w:eastAsia="Times New Roman" w:hAnsi="Times New Roman" w:cs="Times New Roman"/>
+          <w:i/>
+          <w:iCs/>
+          <w:sz w:val="24"/>
+          <w:szCs w:val="24"/>
+        </w:rPr>
+        <w:t xml:space="preserve"> </w:t>
+      </w:r>
+      <w:proofErr w:type="spellStart"/>
       <w:r>
         <w:rPr>
           <w:rFonts w:ascii="Nirmala UI" w:eastAsia="Times New Roman" w:hAnsi="Nirmala UI" w:cs="Nirmala UI"/>
@@ -840,16 +859,18 @@
         </w:rPr>
         <w:t>ভবিষ্যতের</w:t>
       </w:r>
-      <w:r>
-        <w:rPr>
-          <w:rFonts w:ascii="Times New Roman" w:eastAsia="Times New Roman" w:hAnsi="Times New Roman" w:cs="Times New Roman"/>
-          <w:i/>
-          <w:iCs/>
-          <w:sz w:val="24"/>
-          <w:szCs w:val="24"/>
-        </w:rPr>
-        <w:t xml:space="preserve"> </w:t>
-      </w:r>
+      <w:proofErr w:type="spellEnd"/>
+      <w:r>
+        <w:rPr>
+          <w:rFonts w:ascii="Times New Roman" w:eastAsia="Times New Roman" w:hAnsi="Times New Roman" w:cs="Times New Roman"/>
+          <w:i/>
+          <w:iCs/>
+          <w:sz w:val="24"/>
+          <w:szCs w:val="24"/>
+        </w:rPr>
+        <w:t xml:space="preserve"> </w:t>
+      </w:r>
+      <w:proofErr w:type="spellStart"/>
       <w:r>
         <w:rPr>
           <w:rFonts w:ascii="Nirmala UI" w:eastAsia="Times New Roman" w:hAnsi="Nirmala UI" w:cs="Nirmala UI"/>
@@ -860,16 +881,18 @@
         </w:rPr>
         <w:t>যেকোনো</w:t>
       </w:r>
-      <w:r>
-        <w:rPr>
-          <w:rFonts w:ascii="Times New Roman" w:eastAsia="Times New Roman" w:hAnsi="Times New Roman" w:cs="Times New Roman"/>
-          <w:i/>
-          <w:iCs/>
-          <w:sz w:val="24"/>
-          <w:szCs w:val="24"/>
-        </w:rPr>
-        <w:t xml:space="preserve"> </w:t>
-      </w:r>
+      <w:proofErr w:type="spellEnd"/>
+      <w:r>
+        <w:rPr>
+          <w:rFonts w:ascii="Times New Roman" w:eastAsia="Times New Roman" w:hAnsi="Times New Roman" w:cs="Times New Roman"/>
+          <w:i/>
+          <w:iCs/>
+          <w:sz w:val="24"/>
+          <w:szCs w:val="24"/>
+        </w:rPr>
+        <w:t xml:space="preserve"> </w:t>
+      </w:r>
+      <w:proofErr w:type="spellStart"/>
       <w:r>
         <w:rPr>
           <w:rFonts w:ascii="Nirmala UI" w:eastAsia="Times New Roman" w:hAnsi="Nirmala UI" w:cs="Nirmala UI"/>
@@ -880,16 +903,18 @@
         </w:rPr>
         <w:t>তারিখ</w:t>
       </w:r>
-      <w:r>
-        <w:rPr>
-          <w:rFonts w:ascii="Times New Roman" w:eastAsia="Times New Roman" w:hAnsi="Times New Roman" w:cs="Times New Roman"/>
-          <w:i/>
-          <w:iCs/>
-          <w:sz w:val="24"/>
-          <w:szCs w:val="24"/>
-        </w:rPr>
-        <w:t xml:space="preserve"> </w:t>
-      </w:r>
+      <w:proofErr w:type="spellEnd"/>
+      <w:r>
+        <w:rPr>
+          <w:rFonts w:ascii="Times New Roman" w:eastAsia="Times New Roman" w:hAnsi="Times New Roman" w:cs="Times New Roman"/>
+          <w:i/>
+          <w:iCs/>
+          <w:sz w:val="24"/>
+          <w:szCs w:val="24"/>
+        </w:rPr>
+        <w:t xml:space="preserve"> </w:t>
+      </w:r>
+      <w:proofErr w:type="spellStart"/>
       <w:r>
         <w:rPr>
           <w:rFonts w:ascii="Nirmala UI" w:eastAsia="Times New Roman" w:hAnsi="Nirmala UI" w:cs="Nirmala UI"/>
@@ -900,25 +925,38 @@
         </w:rPr>
         <w:t>দিতে</w:t>
       </w:r>
-      <w:r>
-        <w:rPr>
-          <w:rFonts w:ascii="Times New Roman" w:eastAsia="Times New Roman" w:hAnsi="Times New Roman" w:cs="Times New Roman"/>
-          <w:i/>
-          <w:iCs/>
-          <w:sz w:val="24"/>
-          <w:szCs w:val="24"/>
-        </w:rPr>
-        <w:t xml:space="preserve"> </w:t>
-      </w:r>
-      <w:r>
-        <w:rPr>
-          <w:rFonts w:ascii="Nirmala UI" w:eastAsia="Times New Roman" w:hAnsi="Nirmala UI" w:cs="Nirmala UI"/>
-          <w:i/>
-          <w:iCs/>
-          <w:sz w:val="24"/>
-          <w:szCs w:val="24"/>
-        </w:rPr>
-        <w:t>পারেন।</w:t>
+      <w:proofErr w:type="spellEnd"/>
+      <w:r>
+        <w:rPr>
+          <w:rFonts w:ascii="Times New Roman" w:eastAsia="Times New Roman" w:hAnsi="Times New Roman" w:cs="Times New Roman"/>
+          <w:i/>
+          <w:iCs/>
+          <w:sz w:val="24"/>
+          <w:szCs w:val="24"/>
+        </w:rPr>
+        <w:t xml:space="preserve"> </w:t>
+      </w:r>
+      <w:proofErr w:type="spellStart"/>
+      <w:r>
+        <w:rPr>
+          <w:rFonts w:ascii="Nirmala UI" w:eastAsia="Times New Roman" w:hAnsi="Nirmala UI" w:cs="Nirmala UI"/>
+          <w:i/>
+          <w:iCs/>
+          <w:sz w:val="24"/>
+          <w:szCs w:val="24"/>
+        </w:rPr>
+        <w:t>পারেন</w:t>
+      </w:r>
+      <w:proofErr w:type="spellEnd"/>
+      <w:r>
+        <w:rPr>
+          <w:rFonts w:ascii="Nirmala UI" w:eastAsia="Times New Roman" w:hAnsi="Nirmala UI" w:cs="Nirmala UI"/>
+          <w:i/>
+          <w:iCs/>
+          <w:sz w:val="24"/>
+          <w:szCs w:val="24"/>
+        </w:rPr>
+        <w:t>।</w:t>
       </w:r>
     </w:p>
     <w:p>
@@ -930,6 +968,7 @@
           <w:szCs w:val="24"/>
         </w:rPr>
       </w:pPr>
+      <w:proofErr w:type="spellStart"/>
       <w:r>
         <w:rPr>
           <w:rFonts w:ascii="Nirmala UI" w:eastAsia="Times New Roman" w:hAnsi="Nirmala UI" w:cs="Nirmala UI"/>
@@ -940,6 +979,7 @@
         </w:rPr>
         <w:t>এন্ট্রি</w:t>
       </w:r>
+      <w:proofErr w:type="spellEnd"/>
       <w:r>
         <w:rPr>
           <w:rFonts w:ascii="Times New Roman" w:eastAsia="Times New Roman" w:hAnsi="Times New Roman" w:cs="Times New Roman"/>
@@ -970,6 +1010,7 @@
         </w:rPr>
         <w:t xml:space="preserve"> (</w:t>
       </w:r>
+      <w:proofErr w:type="spellStart"/>
       <w:r>
         <w:rPr>
           <w:rFonts w:ascii="Nirmala UI" w:eastAsia="Times New Roman" w:hAnsi="Nirmala UI" w:cs="Nirmala UI"/>
@@ -980,16 +1021,18 @@
         </w:rPr>
         <w:t>পার্সেন্টেজ</w:t>
       </w:r>
-      <w:r>
-        <w:rPr>
-          <w:rFonts w:ascii="Times New Roman" w:eastAsia="Times New Roman" w:hAnsi="Times New Roman" w:cs="Times New Roman"/>
-          <w:b/>
-          <w:bCs/>
-          <w:sz w:val="24"/>
-          <w:szCs w:val="24"/>
-        </w:rPr>
-        <w:t xml:space="preserve"> </w:t>
-      </w:r>
+      <w:proofErr w:type="spellEnd"/>
+      <w:r>
+        <w:rPr>
+          <w:rFonts w:ascii="Times New Roman" w:eastAsia="Times New Roman" w:hAnsi="Times New Roman" w:cs="Times New Roman"/>
+          <w:b/>
+          <w:bCs/>
+          <w:sz w:val="24"/>
+          <w:szCs w:val="24"/>
+        </w:rPr>
+        <w:t xml:space="preserve"> </w:t>
+      </w:r>
+      <w:proofErr w:type="spellStart"/>
       <w:r>
         <w:rPr>
           <w:rFonts w:ascii="Nirmala UI" w:eastAsia="Times New Roman" w:hAnsi="Nirmala UI" w:cs="Nirmala UI"/>
@@ -1000,6 +1043,7 @@
         </w:rPr>
         <w:t>ডিসকাউন্ট</w:t>
       </w:r>
+      <w:proofErr w:type="spellEnd"/>
       <w:r>
         <w:rPr>
           <w:rFonts w:ascii="Times New Roman" w:eastAsia="Times New Roman" w:hAnsi="Times New Roman" w:cs="Times New Roman"/>
@@ -1318,6 +1362,7 @@
           <w:szCs w:val="24"/>
         </w:rPr>
       </w:pPr>
+      <w:proofErr w:type="spellStart"/>
       <w:r>
         <w:rPr>
           <w:rFonts w:ascii="Nirmala UI" w:eastAsia="Times New Roman" w:hAnsi="Nirmala UI" w:cs="Nirmala UI"/>
@@ -1328,6 +1373,7 @@
         </w:rPr>
         <w:t>এন্ট্রি</w:t>
       </w:r>
+      <w:proofErr w:type="spellEnd"/>
       <w:r>
         <w:rPr>
           <w:rFonts w:ascii="Times New Roman" w:eastAsia="Times New Roman" w:hAnsi="Times New Roman" w:cs="Times New Roman"/>
@@ -1358,6 +1404,7 @@
         </w:rPr>
         <w:t xml:space="preserve"> (</w:t>
       </w:r>
+      <w:proofErr w:type="spellStart"/>
       <w:r>
         <w:rPr>
           <w:rFonts w:ascii="Nirmala UI" w:eastAsia="Times New Roman" w:hAnsi="Nirmala UI" w:cs="Nirmala UI"/>
@@ -1368,16 +1415,18 @@
         </w:rPr>
         <w:t>ফিক্সড</w:t>
       </w:r>
-      <w:r>
-        <w:rPr>
-          <w:rFonts w:ascii="Times New Roman" w:eastAsia="Times New Roman" w:hAnsi="Times New Roman" w:cs="Times New Roman"/>
-          <w:b/>
-          <w:bCs/>
-          <w:sz w:val="24"/>
-          <w:szCs w:val="24"/>
-        </w:rPr>
-        <w:t xml:space="preserve"> </w:t>
-      </w:r>
+      <w:proofErr w:type="spellEnd"/>
+      <w:r>
+        <w:rPr>
+          <w:rFonts w:ascii="Times New Roman" w:eastAsia="Times New Roman" w:hAnsi="Times New Roman" w:cs="Times New Roman"/>
+          <w:b/>
+          <w:bCs/>
+          <w:sz w:val="24"/>
+          <w:szCs w:val="24"/>
+        </w:rPr>
+        <w:t xml:space="preserve"> </w:t>
+      </w:r>
+      <w:proofErr w:type="spellStart"/>
       <w:r>
         <w:rPr>
           <w:rFonts w:ascii="Nirmala UI" w:eastAsia="Times New Roman" w:hAnsi="Nirmala UI" w:cs="Nirmala UI"/>
@@ -1388,16 +1437,18 @@
         </w:rPr>
         <w:t>অ্যামাউন্ট</w:t>
       </w:r>
-      <w:r>
-        <w:rPr>
-          <w:rFonts w:ascii="Times New Roman" w:eastAsia="Times New Roman" w:hAnsi="Times New Roman" w:cs="Times New Roman"/>
-          <w:b/>
-          <w:bCs/>
-          <w:sz w:val="24"/>
-          <w:szCs w:val="24"/>
-        </w:rPr>
-        <w:t xml:space="preserve"> </w:t>
-      </w:r>
+      <w:proofErr w:type="spellEnd"/>
+      <w:r>
+        <w:rPr>
+          <w:rFonts w:ascii="Times New Roman" w:eastAsia="Times New Roman" w:hAnsi="Times New Roman" w:cs="Times New Roman"/>
+          <w:b/>
+          <w:bCs/>
+          <w:sz w:val="24"/>
+          <w:szCs w:val="24"/>
+        </w:rPr>
+        <w:t xml:space="preserve"> </w:t>
+      </w:r>
+      <w:proofErr w:type="spellStart"/>
       <w:r>
         <w:rPr>
           <w:rFonts w:ascii="Nirmala UI" w:eastAsia="Times New Roman" w:hAnsi="Nirmala UI" w:cs="Nirmala UI"/>
@@ -1408,6 +1459,7 @@
         </w:rPr>
         <w:t>ডিসকাউন্ট</w:t>
       </w:r>
+      <w:proofErr w:type="spellEnd"/>
       <w:r>
         <w:rPr>
           <w:rFonts w:ascii="Times New Roman" w:eastAsia="Times New Roman" w:hAnsi="Times New Roman" w:cs="Times New Roman"/>
@@ -1749,6 +1801,7 @@
         </w:rPr>
         <w:t>. Cancellation Clauses &amp; Policies (</w:t>
       </w:r>
+      <w:proofErr w:type="spellStart"/>
       <w:r>
         <w:rPr>
           <w:rFonts w:ascii="Nirmala UI" w:eastAsia="Times New Roman" w:hAnsi="Nirmala UI" w:cs="Nirmala UI"/>
@@ -1759,6 +1812,7 @@
         </w:rPr>
         <w:t>ক্যান্সেলেশন</w:t>
       </w:r>
+      <w:proofErr w:type="spellEnd"/>
       <w:r>
         <w:rPr>
           <w:rFonts w:ascii="Times New Roman" w:eastAsia="Times New Roman" w:hAnsi="Times New Roman" w:cs="Times New Roman"/>
@@ -1769,6 +1823,7 @@
         </w:rPr>
         <w:t xml:space="preserve"> </w:t>
       </w:r>
+      <w:proofErr w:type="spellStart"/>
       <w:r>
         <w:rPr>
           <w:rFonts w:ascii="Nirmala UI" w:eastAsia="Times New Roman" w:hAnsi="Nirmala UI" w:cs="Nirmala UI"/>
@@ -1779,6 +1834,7 @@
         </w:rPr>
         <w:t>পলিসি</w:t>
       </w:r>
+      <w:proofErr w:type="spellEnd"/>
       <w:r>
         <w:rPr>
           <w:rFonts w:ascii="Times New Roman" w:eastAsia="Times New Roman" w:hAnsi="Times New Roman" w:cs="Times New Roman"/>
@@ -1870,7 +1926,29 @@
                 <w:sz w:val="24"/>
                 <w:szCs w:val="24"/>
               </w:rPr>
-              <w:t>Hour Threshold Limit (Before Checkin)</w:t>
+              <w:t xml:space="preserve">Hour Threshold Limit (Before </w:t>
+            </w:r>
+            <w:proofErr w:type="spellStart"/>
+            <w:r>
+              <w:rPr>
+                <w:rFonts w:ascii="Times New Roman" w:eastAsia="Times New Roman" w:hAnsi="Times New Roman" w:cs="Times New Roman"/>
+                <w:b/>
+                <w:bCs/>
+                <w:sz w:val="24"/>
+                <w:szCs w:val="24"/>
+              </w:rPr>
+              <w:t>Checkin</w:t>
+            </w:r>
+            <w:proofErr w:type="spellEnd"/>
+            <w:r>
+              <w:rPr>
+                <w:rFonts w:ascii="Times New Roman" w:eastAsia="Times New Roman" w:hAnsi="Times New Roman" w:cs="Times New Roman"/>
+                <w:b/>
+                <w:bCs/>
+                <w:sz w:val="24"/>
+                <w:szCs w:val="24"/>
+              </w:rPr>
+              <w:t>)</w:t>
             </w:r>
           </w:p>
         </w:tc>
@@ -2399,6 +2477,7 @@
         </w:rPr>
         <w:t>. Hotel &amp; Room Amenities Catalog (</w:t>
       </w:r>
+      <w:proofErr w:type="spellStart"/>
       <w:r>
         <w:rPr>
           <w:rFonts w:ascii="Nirmala UI" w:eastAsia="Times New Roman" w:hAnsi="Nirmala UI" w:cs="Nirmala UI"/>
@@ -2409,6 +2488,7 @@
         </w:rPr>
         <w:t>অ্যামেনিটি</w:t>
       </w:r>
+      <w:proofErr w:type="spellEnd"/>
       <w:r>
         <w:rPr>
           <w:rFonts w:ascii="Times New Roman" w:eastAsia="Times New Roman" w:hAnsi="Times New Roman" w:cs="Times New Roman"/>
@@ -2419,6 +2499,7 @@
         </w:rPr>
         <w:t xml:space="preserve"> </w:t>
       </w:r>
+      <w:proofErr w:type="spellStart"/>
       <w:r>
         <w:rPr>
           <w:rFonts w:ascii="Nirmala UI" w:eastAsia="Times New Roman" w:hAnsi="Nirmala UI" w:cs="Nirmala UI"/>
@@ -2429,6 +2510,7 @@
         </w:rPr>
         <w:t>এন্ট্রি</w:t>
       </w:r>
+      <w:proofErr w:type="spellEnd"/>
       <w:r>
         <w:rPr>
           <w:rFonts w:ascii="Times New Roman" w:eastAsia="Times New Roman" w:hAnsi="Times New Roman" w:cs="Times New Roman"/>
@@ -2511,6 +2593,7 @@
                 <w:szCs w:val="24"/>
               </w:rPr>
             </w:pPr>
+            <w:proofErr w:type="spellStart"/>
             <w:r>
               <w:rPr>
                 <w:rFonts w:ascii="Times New Roman" w:eastAsia="Times New Roman" w:hAnsi="Times New Roman" w:cs="Times New Roman"/>
@@ -2519,7 +2602,18 @@
                 <w:sz w:val="24"/>
                 <w:szCs w:val="24"/>
               </w:rPr>
-              <w:t>FontAwesome CSS Icon Class</w:t>
+              <w:t>FontAwesome</w:t>
+            </w:r>
+            <w:proofErr w:type="spellEnd"/>
+            <w:r>
+              <w:rPr>
+                <w:rFonts w:ascii="Times New Roman" w:eastAsia="Times New Roman" w:hAnsi="Times New Roman" w:cs="Times New Roman"/>
+                <w:b/>
+                <w:bCs/>
+                <w:sz w:val="24"/>
+                <w:szCs w:val="24"/>
+              </w:rPr>
+              <w:t xml:space="preserve"> CSS Icon Class</w:t>
             </w:r>
           </w:p>
         </w:tc>
@@ -2630,6 +2724,7 @@
                 <w:szCs w:val="24"/>
               </w:rPr>
             </w:pPr>
+            <w:proofErr w:type="spellStart"/>
             <w:r>
               <w:rPr>
                 <w:rFonts w:ascii="Courier New" w:eastAsia="Times New Roman" w:hAnsi="Courier New" w:cs="Courier New"/>
@@ -2637,6 +2732,7 @@
               </w:rPr>
               <w:t>fa-wifi</w:t>
             </w:r>
+            <w:proofErr w:type="spellEnd"/>
           </w:p>
         </w:tc>
         <w:tc>
@@ -2736,6 +2832,7 @@
                 <w:szCs w:val="24"/>
               </w:rPr>
             </w:pPr>
+            <w:proofErr w:type="spellStart"/>
             <w:r>
               <w:rPr>
                 <w:rFonts w:ascii="Courier New" w:eastAsia="Times New Roman" w:hAnsi="Courier New" w:cs="Courier New"/>
@@ -2743,6 +2840,7 @@
               </w:rPr>
               <w:t>fa-tv</w:t>
             </w:r>
+            <w:proofErr w:type="spellEnd"/>
           </w:p>
         </w:tc>
         <w:tc>
@@ -2842,12 +2940,21 @@
                 <w:szCs w:val="24"/>
               </w:rPr>
             </w:pPr>
+            <w:proofErr w:type="spellStart"/>
             <w:r>
               <w:rPr>
                 <w:rFonts w:ascii="Courier New" w:eastAsia="Times New Roman" w:hAnsi="Courier New" w:cs="Courier New"/>
                 <w:sz w:val="20"/>
               </w:rPr>
-              <w:t>fa-snowflake-o</w:t>
+              <w:t>fa</w:t>
+            </w:r>
+            <w:proofErr w:type="spellEnd"/>
+            <w:r>
+              <w:rPr>
+                <w:rFonts w:ascii="Courier New" w:eastAsia="Times New Roman" w:hAnsi="Courier New" w:cs="Courier New"/>
+                <w:sz w:val="20"/>
+              </w:rPr>
+              <w:t>-snowflake-o</w:t>
             </w:r>
           </w:p>
         </w:tc>
@@ -2948,12 +3055,21 @@
                 <w:szCs w:val="24"/>
               </w:rPr>
             </w:pPr>
+            <w:proofErr w:type="spellStart"/>
             <w:r>
               <w:rPr>
                 <w:rFonts w:ascii="Courier New" w:eastAsia="Times New Roman" w:hAnsi="Courier New" w:cs="Courier New"/>
                 <w:sz w:val="20"/>
               </w:rPr>
-              <w:t>fa-snowflake-o</w:t>
+              <w:t>fa</w:t>
+            </w:r>
+            <w:proofErr w:type="spellEnd"/>
+            <w:r>
+              <w:rPr>
+                <w:rFonts w:ascii="Courier New" w:eastAsia="Times New Roman" w:hAnsi="Courier New" w:cs="Courier New"/>
+                <w:sz w:val="20"/>
+              </w:rPr>
+              <w:t>-snowflake-o</w:t>
             </w:r>
           </w:p>
         </w:tc>
@@ -3041,6 +3157,7 @@
         </w:rPr>
         <w:t>. Other Revenue &amp; Payment Invoices (</w:t>
       </w:r>
+      <w:proofErr w:type="spellStart"/>
       <w:r>
         <w:rPr>
           <w:rFonts w:ascii="Nirmala UI" w:eastAsia="Times New Roman" w:hAnsi="Nirmala UI" w:cs="Nirmala UI"/>
@@ -3051,6 +3168,7 @@
         </w:rPr>
         <w:t>অন্যান্য</w:t>
       </w:r>
+      <w:proofErr w:type="spellEnd"/>
       <w:r>
         <w:rPr>
           <w:rFonts w:ascii="Times New Roman" w:eastAsia="Times New Roman" w:hAnsi="Times New Roman" w:cs="Times New Roman"/>
@@ -3061,6 +3179,7 @@
         </w:rPr>
         <w:t xml:space="preserve"> </w:t>
       </w:r>
+      <w:proofErr w:type="spellStart"/>
       <w:r>
         <w:rPr>
           <w:rFonts w:ascii="Nirmala UI" w:eastAsia="Times New Roman" w:hAnsi="Nirmala UI" w:cs="Nirmala UI"/>
@@ -3071,6 +3190,7 @@
         </w:rPr>
         <w:t>পেমেন্ট</w:t>
       </w:r>
+      <w:proofErr w:type="spellEnd"/>
       <w:r>
         <w:rPr>
           <w:rFonts w:ascii="Times New Roman" w:eastAsia="Times New Roman" w:hAnsi="Times New Roman" w:cs="Times New Roman"/>
@@ -3081,6 +3201,7 @@
         </w:rPr>
         <w:t>/</w:t>
       </w:r>
+      <w:proofErr w:type="spellStart"/>
       <w:r>
         <w:rPr>
           <w:rFonts w:ascii="Nirmala UI" w:eastAsia="Times New Roman" w:hAnsi="Nirmala UI" w:cs="Nirmala UI"/>
@@ -3091,6 +3212,7 @@
         </w:rPr>
         <w:t>ইনভয়েস</w:t>
       </w:r>
+      <w:proofErr w:type="spellEnd"/>
       <w:r>
         <w:rPr>
           <w:rFonts w:ascii="Times New Roman" w:eastAsia="Times New Roman" w:hAnsi="Times New Roman" w:cs="Times New Roman"/>
@@ -3111,6 +3233,7 @@
           <w:szCs w:val="24"/>
         </w:rPr>
       </w:pPr>
+      <w:proofErr w:type="spellStart"/>
       <w:r>
         <w:rPr>
           <w:rFonts w:ascii="Nirmala UI" w:eastAsia="Times New Roman" w:hAnsi="Nirmala UI" w:cs="Nirmala UI"/>
@@ -3121,16 +3244,18 @@
         </w:rPr>
         <w:t>ইনভয়েস</w:t>
       </w:r>
-      <w:r>
-        <w:rPr>
-          <w:rFonts w:ascii="Times New Roman" w:eastAsia="Times New Roman" w:hAnsi="Times New Roman" w:cs="Times New Roman"/>
-          <w:i/>
-          <w:iCs/>
-          <w:sz w:val="24"/>
-          <w:szCs w:val="24"/>
-        </w:rPr>
-        <w:t xml:space="preserve"> </w:t>
-      </w:r>
+      <w:proofErr w:type="spellEnd"/>
+      <w:r>
+        <w:rPr>
+          <w:rFonts w:ascii="Times New Roman" w:eastAsia="Times New Roman" w:hAnsi="Times New Roman" w:cs="Times New Roman"/>
+          <w:i/>
+          <w:iCs/>
+          <w:sz w:val="24"/>
+          <w:szCs w:val="24"/>
+        </w:rPr>
+        <w:t xml:space="preserve"> </w:t>
+      </w:r>
+      <w:proofErr w:type="spellStart"/>
       <w:r>
         <w:rPr>
           <w:rFonts w:ascii="Nirmala UI" w:eastAsia="Times New Roman" w:hAnsi="Nirmala UI" w:cs="Nirmala UI"/>
@@ -3141,16 +3266,18 @@
         </w:rPr>
         <w:t>নম্বরটি</w:t>
       </w:r>
-      <w:r>
-        <w:rPr>
-          <w:rFonts w:ascii="Times New Roman" w:eastAsia="Times New Roman" w:hAnsi="Times New Roman" w:cs="Times New Roman"/>
-          <w:i/>
-          <w:iCs/>
-          <w:sz w:val="24"/>
-          <w:szCs w:val="24"/>
-        </w:rPr>
-        <w:t xml:space="preserve"> </w:t>
-      </w:r>
+      <w:proofErr w:type="spellEnd"/>
+      <w:r>
+        <w:rPr>
+          <w:rFonts w:ascii="Times New Roman" w:eastAsia="Times New Roman" w:hAnsi="Times New Roman" w:cs="Times New Roman"/>
+          <w:i/>
+          <w:iCs/>
+          <w:sz w:val="24"/>
+          <w:szCs w:val="24"/>
+        </w:rPr>
+        <w:t xml:space="preserve"> </w:t>
+      </w:r>
+      <w:proofErr w:type="spellStart"/>
       <w:r>
         <w:rPr>
           <w:rFonts w:ascii="Nirmala UI" w:eastAsia="Times New Roman" w:hAnsi="Nirmala UI" w:cs="Nirmala UI"/>
@@ -3181,16 +3308,18 @@
         </w:rPr>
         <w:t>জেনারেট</w:t>
       </w:r>
-      <w:r>
-        <w:rPr>
-          <w:rFonts w:ascii="Times New Roman" w:eastAsia="Times New Roman" w:hAnsi="Times New Roman" w:cs="Times New Roman"/>
-          <w:i/>
-          <w:iCs/>
-          <w:sz w:val="24"/>
-          <w:szCs w:val="24"/>
-        </w:rPr>
-        <w:t xml:space="preserve"> </w:t>
-      </w:r>
+      <w:proofErr w:type="spellEnd"/>
+      <w:r>
+        <w:rPr>
+          <w:rFonts w:ascii="Times New Roman" w:eastAsia="Times New Roman" w:hAnsi="Times New Roman" w:cs="Times New Roman"/>
+          <w:i/>
+          <w:iCs/>
+          <w:sz w:val="24"/>
+          <w:szCs w:val="24"/>
+        </w:rPr>
+        <w:t xml:space="preserve"> </w:t>
+      </w:r>
+      <w:proofErr w:type="spellStart"/>
       <w:r>
         <w:rPr>
           <w:rFonts w:ascii="Nirmala UI" w:eastAsia="Times New Roman" w:hAnsi="Nirmala UI" w:cs="Nirmala UI"/>
@@ -3201,16 +3330,18 @@
         </w:rPr>
         <w:t>হবে</w:t>
       </w:r>
-      <w:r>
-        <w:rPr>
-          <w:rFonts w:ascii="Times New Roman" w:eastAsia="Times New Roman" w:hAnsi="Times New Roman" w:cs="Times New Roman"/>
-          <w:i/>
-          <w:iCs/>
-          <w:sz w:val="24"/>
-          <w:szCs w:val="24"/>
-        </w:rPr>
-        <w:t xml:space="preserve"> </w:t>
-      </w:r>
+      <w:proofErr w:type="spellEnd"/>
+      <w:r>
+        <w:rPr>
+          <w:rFonts w:ascii="Times New Roman" w:eastAsia="Times New Roman" w:hAnsi="Times New Roman" w:cs="Times New Roman"/>
+          <w:i/>
+          <w:iCs/>
+          <w:sz w:val="24"/>
+          <w:szCs w:val="24"/>
+        </w:rPr>
+        <w:t xml:space="preserve"> </w:t>
+      </w:r>
+      <w:proofErr w:type="spellStart"/>
       <w:r>
         <w:rPr>
           <w:rFonts w:ascii="Nirmala UI" w:eastAsia="Times New Roman" w:hAnsi="Nirmala UI" w:cs="Nirmala UI"/>
@@ -3221,16 +3352,18 @@
         </w:rPr>
         <w:t>এবং</w:t>
       </w:r>
-      <w:r>
-        <w:rPr>
-          <w:rFonts w:ascii="Times New Roman" w:eastAsia="Times New Roman" w:hAnsi="Times New Roman" w:cs="Times New Roman"/>
-          <w:i/>
-          <w:iCs/>
-          <w:sz w:val="24"/>
-          <w:szCs w:val="24"/>
-        </w:rPr>
-        <w:t xml:space="preserve"> </w:t>
-      </w:r>
+      <w:proofErr w:type="spellEnd"/>
+      <w:r>
+        <w:rPr>
+          <w:rFonts w:ascii="Times New Roman" w:eastAsia="Times New Roman" w:hAnsi="Times New Roman" w:cs="Times New Roman"/>
+          <w:i/>
+          <w:iCs/>
+          <w:sz w:val="24"/>
+          <w:szCs w:val="24"/>
+        </w:rPr>
+        <w:t xml:space="preserve"> </w:t>
+      </w:r>
+      <w:proofErr w:type="spellStart"/>
       <w:r>
         <w:rPr>
           <w:rFonts w:ascii="Nirmala UI" w:eastAsia="Times New Roman" w:hAnsi="Nirmala UI" w:cs="Nirmala UI"/>
@@ -3241,16 +3374,18 @@
         </w:rPr>
         <w:t>ডেট</w:t>
       </w:r>
-      <w:r>
-        <w:rPr>
-          <w:rFonts w:ascii="Times New Roman" w:eastAsia="Times New Roman" w:hAnsi="Times New Roman" w:cs="Times New Roman"/>
-          <w:i/>
-          <w:iCs/>
-          <w:sz w:val="24"/>
-          <w:szCs w:val="24"/>
-        </w:rPr>
-        <w:t xml:space="preserve"> </w:t>
-      </w:r>
+      <w:proofErr w:type="spellEnd"/>
+      <w:r>
+        <w:rPr>
+          <w:rFonts w:ascii="Times New Roman" w:eastAsia="Times New Roman" w:hAnsi="Times New Roman" w:cs="Times New Roman"/>
+          <w:i/>
+          <w:iCs/>
+          <w:sz w:val="24"/>
+          <w:szCs w:val="24"/>
+        </w:rPr>
+        <w:t xml:space="preserve"> </w:t>
+      </w:r>
+      <w:proofErr w:type="spellStart"/>
       <w:r>
         <w:rPr>
           <w:rFonts w:ascii="Nirmala UI" w:eastAsia="Times New Roman" w:hAnsi="Nirmala UI" w:cs="Nirmala UI"/>
@@ -3261,25 +3396,38 @@
         </w:rPr>
         <w:t>আজকেরটাই</w:t>
       </w:r>
-      <w:r>
-        <w:rPr>
-          <w:rFonts w:ascii="Times New Roman" w:eastAsia="Times New Roman" w:hAnsi="Times New Roman" w:cs="Times New Roman"/>
-          <w:i/>
-          <w:iCs/>
-          <w:sz w:val="24"/>
-          <w:szCs w:val="24"/>
-        </w:rPr>
-        <w:t xml:space="preserve"> </w:t>
-      </w:r>
-      <w:r>
-        <w:rPr>
-          <w:rFonts w:ascii="Nirmala UI" w:eastAsia="Times New Roman" w:hAnsi="Nirmala UI" w:cs="Nirmala UI"/>
-          <w:i/>
-          <w:iCs/>
-          <w:sz w:val="24"/>
-          <w:szCs w:val="24"/>
-        </w:rPr>
-        <w:t>থাকবে।</w:t>
+      <w:proofErr w:type="spellEnd"/>
+      <w:r>
+        <w:rPr>
+          <w:rFonts w:ascii="Times New Roman" w:eastAsia="Times New Roman" w:hAnsi="Times New Roman" w:cs="Times New Roman"/>
+          <w:i/>
+          <w:iCs/>
+          <w:sz w:val="24"/>
+          <w:szCs w:val="24"/>
+        </w:rPr>
+        <w:t xml:space="preserve"> </w:t>
+      </w:r>
+      <w:proofErr w:type="spellStart"/>
+      <w:r>
+        <w:rPr>
+          <w:rFonts w:ascii="Nirmala UI" w:eastAsia="Times New Roman" w:hAnsi="Nirmala UI" w:cs="Nirmala UI"/>
+          <w:i/>
+          <w:iCs/>
+          <w:sz w:val="24"/>
+          <w:szCs w:val="24"/>
+        </w:rPr>
+        <w:t>থাকবে</w:t>
+      </w:r>
+      <w:proofErr w:type="spellEnd"/>
+      <w:r>
+        <w:rPr>
+          <w:rFonts w:ascii="Nirmala UI" w:eastAsia="Times New Roman" w:hAnsi="Nirmala UI" w:cs="Nirmala UI"/>
+          <w:i/>
+          <w:iCs/>
+          <w:sz w:val="24"/>
+          <w:szCs w:val="24"/>
+        </w:rPr>
+        <w:t>।</w:t>
       </w:r>
     </w:p>
     <w:p>
@@ -3291,6 +3439,7 @@
           <w:szCs w:val="24"/>
         </w:rPr>
       </w:pPr>
+      <w:proofErr w:type="spellStart"/>
       <w:r>
         <w:rPr>
           <w:rFonts w:ascii="Nirmala UI" w:eastAsia="Times New Roman" w:hAnsi="Nirmala UI" w:cs="Nirmala UI"/>
@@ -3301,16 +3450,18 @@
         </w:rPr>
         <w:t>গ্রাহকের</w:t>
       </w:r>
-      <w:r>
-        <w:rPr>
-          <w:rFonts w:ascii="Times New Roman" w:eastAsia="Times New Roman" w:hAnsi="Times New Roman" w:cs="Times New Roman"/>
-          <w:b/>
-          <w:bCs/>
-          <w:sz w:val="24"/>
-          <w:szCs w:val="24"/>
-        </w:rPr>
-        <w:t xml:space="preserve"> </w:t>
-      </w:r>
+      <w:proofErr w:type="spellEnd"/>
+      <w:r>
+        <w:rPr>
+          <w:rFonts w:ascii="Times New Roman" w:eastAsia="Times New Roman" w:hAnsi="Times New Roman" w:cs="Times New Roman"/>
+          <w:b/>
+          <w:bCs/>
+          <w:sz w:val="24"/>
+          <w:szCs w:val="24"/>
+        </w:rPr>
+        <w:t xml:space="preserve"> </w:t>
+      </w:r>
+      <w:proofErr w:type="spellStart"/>
       <w:r>
         <w:rPr>
           <w:rFonts w:ascii="Nirmala UI" w:eastAsia="Times New Roman" w:hAnsi="Nirmala UI" w:cs="Nirmala UI"/>
@@ -3321,6 +3472,7 @@
         </w:rPr>
         <w:t>তথ্য</w:t>
       </w:r>
+      <w:proofErr w:type="spellEnd"/>
       <w:r>
         <w:rPr>
           <w:rFonts w:ascii="Times New Roman" w:eastAsia="Times New Roman" w:hAnsi="Times New Roman" w:cs="Times New Roman"/>
@@ -3330,6 +3482,16 @@
           <w:szCs w:val="24"/>
         </w:rPr>
         <w:t>:</w:t>
+      </w:r>
+      <w:r>
+        <w:rPr>
+          <w:rFonts w:ascii="Times New Roman" w:eastAsia="Times New Roman" w:hAnsi="Times New Roman" w:cs="Times New Roman"/>
+          <w:b/>
+          <w:bCs/>
+          <w:sz w:val="24"/>
+          <w:szCs w:val="24"/>
+        </w:rPr>
+        <w:t xml:space="preserve"> INV-2026-001</w:t>
       </w:r>
     </w:p>
     <w:p>
@@ -3363,12 +3525,21 @@
         </w:rPr>
         <w:t xml:space="preserve"> </w:t>
       </w:r>
+      <w:proofErr w:type="spellStart"/>
       <w:r>
         <w:rPr>
           <w:rFonts w:ascii="Courier New" w:eastAsia="Times New Roman" w:hAnsi="Courier New" w:cs="Courier New"/>
           <w:sz w:val="20"/>
         </w:rPr>
-        <w:t>Rahat Khan</w:t>
+        <w:t>Rahat</w:t>
+      </w:r>
+      <w:proofErr w:type="spellEnd"/>
+      <w:r>
+        <w:rPr>
+          <w:rFonts w:ascii="Courier New" w:eastAsia="Times New Roman" w:hAnsi="Courier New" w:cs="Courier New"/>
+          <w:sz w:val="20"/>
+        </w:rPr>
+        <w:t xml:space="preserve"> Khan</w:t>
       </w:r>
     </w:p>
     <w:p>
@@ -3427,6 +3598,7 @@
         </w:rPr>
         <w:t>(</w:t>
       </w:r>
+      <w:proofErr w:type="spellStart"/>
       <w:r>
         <w:rPr>
           <w:rFonts w:ascii="Nirmala UI" w:eastAsia="Times New Roman" w:hAnsi="Nirmala UI" w:cs="Nirmala UI"/>
@@ -3437,16 +3609,18 @@
         </w:rPr>
         <w:t>বা</w:t>
       </w:r>
-      <w:r>
-        <w:rPr>
-          <w:rFonts w:ascii="Times New Roman" w:eastAsia="Times New Roman" w:hAnsi="Times New Roman" w:cs="Times New Roman"/>
-          <w:i/>
-          <w:iCs/>
-          <w:sz w:val="24"/>
-          <w:szCs w:val="24"/>
-        </w:rPr>
-        <w:t xml:space="preserve"> </w:t>
-      </w:r>
+      <w:proofErr w:type="spellEnd"/>
+      <w:r>
+        <w:rPr>
+          <w:rFonts w:ascii="Times New Roman" w:eastAsia="Times New Roman" w:hAnsi="Times New Roman" w:cs="Times New Roman"/>
+          <w:i/>
+          <w:iCs/>
+          <w:sz w:val="24"/>
+          <w:szCs w:val="24"/>
+        </w:rPr>
+        <w:t xml:space="preserve"> </w:t>
+      </w:r>
+      <w:proofErr w:type="spellStart"/>
       <w:r>
         <w:rPr>
           <w:rFonts w:ascii="Nirmala UI" w:eastAsia="Times New Roman" w:hAnsi="Nirmala UI" w:cs="Nirmala UI"/>
@@ -3457,6 +3631,7 @@
         </w:rPr>
         <w:t>যেকোনো</w:t>
       </w:r>
+      <w:proofErr w:type="spellEnd"/>
       <w:r>
         <w:rPr>
           <w:rFonts w:ascii="Times New Roman" w:eastAsia="Times New Roman" w:hAnsi="Times New Roman" w:cs="Times New Roman"/>
@@ -3507,6 +3682,7 @@
         </w:rPr>
         <w:t xml:space="preserve"> </w:t>
       </w:r>
+      <w:proofErr w:type="spellStart"/>
       <w:r>
         <w:rPr>
           <w:rFonts w:ascii="Nirmala UI" w:eastAsia="Times New Roman" w:hAnsi="Nirmala UI" w:cs="Nirmala UI"/>
@@ -3517,16 +3693,18 @@
         </w:rPr>
         <w:t>ডিজিটের</w:t>
       </w:r>
-      <w:r>
-        <w:rPr>
-          <w:rFonts w:ascii="Times New Roman" w:eastAsia="Times New Roman" w:hAnsi="Times New Roman" w:cs="Times New Roman"/>
-          <w:i/>
-          <w:iCs/>
-          <w:sz w:val="24"/>
-          <w:szCs w:val="24"/>
-        </w:rPr>
-        <w:t xml:space="preserve"> </w:t>
-      </w:r>
+      <w:proofErr w:type="spellEnd"/>
+      <w:r>
+        <w:rPr>
+          <w:rFonts w:ascii="Times New Roman" w:eastAsia="Times New Roman" w:hAnsi="Times New Roman" w:cs="Times New Roman"/>
+          <w:i/>
+          <w:iCs/>
+          <w:sz w:val="24"/>
+          <w:szCs w:val="24"/>
+        </w:rPr>
+        <w:t xml:space="preserve"> </w:t>
+      </w:r>
+      <w:proofErr w:type="spellStart"/>
       <w:r>
         <w:rPr>
           <w:rFonts w:ascii="Nirmala UI" w:eastAsia="Times New Roman" w:hAnsi="Nirmala UI" w:cs="Nirmala UI"/>
@@ -3537,6 +3715,7 @@
         </w:rPr>
         <w:t>নম্বর</w:t>
       </w:r>
+      <w:proofErr w:type="spellEnd"/>
       <w:r>
         <w:rPr>
           <w:rFonts w:ascii="Times New Roman" w:eastAsia="Times New Roman" w:hAnsi="Times New Roman" w:cs="Times New Roman"/>
@@ -3604,6 +3783,7 @@
         </w:rPr>
         <w:t>(</w:t>
       </w:r>
+      <w:proofErr w:type="spellStart"/>
       <w:r>
         <w:rPr>
           <w:rFonts w:ascii="Nirmala UI" w:eastAsia="Times New Roman" w:hAnsi="Nirmala UI" w:cs="Nirmala UI"/>
@@ -3614,6 +3794,7 @@
         </w:rPr>
         <w:t>ঐচ্ছিক</w:t>
       </w:r>
+      <w:proofErr w:type="spellEnd"/>
       <w:r>
         <w:rPr>
           <w:rFonts w:ascii="Times New Roman" w:eastAsia="Times New Roman" w:hAnsi="Times New Roman" w:cs="Times New Roman"/>
@@ -3656,12 +3837,21 @@
         </w:rPr>
         <w:t xml:space="preserve"> </w:t>
       </w:r>
+      <w:proofErr w:type="spellStart"/>
       <w:r>
         <w:rPr>
           <w:rFonts w:ascii="Courier New" w:eastAsia="Times New Roman" w:hAnsi="Courier New" w:cs="Courier New"/>
           <w:sz w:val="20"/>
         </w:rPr>
-        <w:t>Dhanmondi, Dhaka</w:t>
+        <w:t>Dhanmondi</w:t>
+      </w:r>
+      <w:proofErr w:type="spellEnd"/>
+      <w:r>
+        <w:rPr>
+          <w:rFonts w:ascii="Courier New" w:eastAsia="Times New Roman" w:hAnsi="Courier New" w:cs="Courier New"/>
+          <w:sz w:val="20"/>
+        </w:rPr>
+        <w:t>, Dhaka</w:t>
       </w:r>
       <w:r>
         <w:rPr>
@@ -3681,6 +3871,7 @@
         </w:rPr>
         <w:t>(</w:t>
       </w:r>
+      <w:proofErr w:type="spellStart"/>
       <w:r>
         <w:rPr>
           <w:rFonts w:ascii="Nirmala UI" w:eastAsia="Times New Roman" w:hAnsi="Nirmala UI" w:cs="Nirmala UI"/>
@@ -3691,6 +3882,7 @@
         </w:rPr>
         <w:t>ঐচ্ছিক</w:t>
       </w:r>
+      <w:proofErr w:type="spellEnd"/>
       <w:r>
         <w:rPr>
           <w:rFonts w:ascii="Times New Roman" w:eastAsia="Times New Roman" w:hAnsi="Times New Roman" w:cs="Times New Roman"/>
@@ -3711,6 +3903,7 @@
           <w:szCs w:val="24"/>
         </w:rPr>
       </w:pPr>
+      <w:proofErr w:type="spellStart"/>
       <w:r>
         <w:rPr>
           <w:rFonts w:ascii="Nirmala UI" w:eastAsia="Times New Roman" w:hAnsi="Nirmala UI" w:cs="Nirmala UI"/>
@@ -3721,16 +3914,18 @@
         </w:rPr>
         <w:t>আইটেম</w:t>
       </w:r>
-      <w:r>
-        <w:rPr>
-          <w:rFonts w:ascii="Times New Roman" w:eastAsia="Times New Roman" w:hAnsi="Times New Roman" w:cs="Times New Roman"/>
-          <w:b/>
-          <w:bCs/>
-          <w:sz w:val="24"/>
-          <w:szCs w:val="24"/>
-        </w:rPr>
-        <w:t xml:space="preserve"> </w:t>
-      </w:r>
+      <w:proofErr w:type="spellEnd"/>
+      <w:r>
+        <w:rPr>
+          <w:rFonts w:ascii="Times New Roman" w:eastAsia="Times New Roman" w:hAnsi="Times New Roman" w:cs="Times New Roman"/>
+          <w:b/>
+          <w:bCs/>
+          <w:sz w:val="24"/>
+          <w:szCs w:val="24"/>
+        </w:rPr>
+        <w:t xml:space="preserve"> </w:t>
+      </w:r>
+      <w:proofErr w:type="spellStart"/>
       <w:r>
         <w:rPr>
           <w:rFonts w:ascii="Nirmala UI" w:eastAsia="Times New Roman" w:hAnsi="Nirmala UI" w:cs="Nirmala UI"/>
@@ -3741,16 +3936,18 @@
         </w:rPr>
         <w:t>গ্রিড</w:t>
       </w:r>
-      <w:r>
-        <w:rPr>
-          <w:rFonts w:ascii="Times New Roman" w:eastAsia="Times New Roman" w:hAnsi="Times New Roman" w:cs="Times New Roman"/>
-          <w:b/>
-          <w:bCs/>
-          <w:sz w:val="24"/>
-          <w:szCs w:val="24"/>
-        </w:rPr>
-        <w:t xml:space="preserve"> </w:t>
-      </w:r>
+      <w:proofErr w:type="spellEnd"/>
+      <w:r>
+        <w:rPr>
+          <w:rFonts w:ascii="Times New Roman" w:eastAsia="Times New Roman" w:hAnsi="Times New Roman" w:cs="Times New Roman"/>
+          <w:b/>
+          <w:bCs/>
+          <w:sz w:val="24"/>
+          <w:szCs w:val="24"/>
+        </w:rPr>
+        <w:t xml:space="preserve"> </w:t>
+      </w:r>
+      <w:proofErr w:type="spellStart"/>
       <w:r>
         <w:rPr>
           <w:rFonts w:ascii="Nirmala UI" w:eastAsia="Times New Roman" w:hAnsi="Nirmala UI" w:cs="Nirmala UI"/>
@@ -3761,6 +3958,7 @@
         </w:rPr>
         <w:t>ডাটা</w:t>
       </w:r>
+      <w:proofErr w:type="spellEnd"/>
       <w:r>
         <w:rPr>
           <w:rFonts w:ascii="Times New Roman" w:eastAsia="Times New Roman" w:hAnsi="Times New Roman" w:cs="Times New Roman"/>
@@ -3771,6 +3969,7 @@
         </w:rPr>
         <w:t xml:space="preserve"> (Add More Item Row </w:t>
       </w:r>
+      <w:proofErr w:type="spellStart"/>
       <w:r>
         <w:rPr>
           <w:rFonts w:ascii="Nirmala UI" w:eastAsia="Times New Roman" w:hAnsi="Nirmala UI" w:cs="Nirmala UI"/>
@@ -3781,16 +3980,18 @@
         </w:rPr>
         <w:t>ক্লিক</w:t>
       </w:r>
-      <w:r>
-        <w:rPr>
-          <w:rFonts w:ascii="Times New Roman" w:eastAsia="Times New Roman" w:hAnsi="Times New Roman" w:cs="Times New Roman"/>
-          <w:b/>
-          <w:bCs/>
-          <w:sz w:val="24"/>
-          <w:szCs w:val="24"/>
-        </w:rPr>
-        <w:t xml:space="preserve"> </w:t>
-      </w:r>
+      <w:proofErr w:type="spellEnd"/>
+      <w:r>
+        <w:rPr>
+          <w:rFonts w:ascii="Times New Roman" w:eastAsia="Times New Roman" w:hAnsi="Times New Roman" w:cs="Times New Roman"/>
+          <w:b/>
+          <w:bCs/>
+          <w:sz w:val="24"/>
+          <w:szCs w:val="24"/>
+        </w:rPr>
+        <w:t xml:space="preserve"> </w:t>
+      </w:r>
+      <w:proofErr w:type="spellStart"/>
       <w:r>
         <w:rPr>
           <w:rFonts w:ascii="Nirmala UI" w:eastAsia="Times New Roman" w:hAnsi="Nirmala UI" w:cs="Nirmala UI"/>
@@ -3801,16 +4002,18 @@
         </w:rPr>
         <w:t>করে</w:t>
       </w:r>
-      <w:r>
-        <w:rPr>
-          <w:rFonts w:ascii="Times New Roman" w:eastAsia="Times New Roman" w:hAnsi="Times New Roman" w:cs="Times New Roman"/>
-          <w:b/>
-          <w:bCs/>
-          <w:sz w:val="24"/>
-          <w:szCs w:val="24"/>
-        </w:rPr>
-        <w:t xml:space="preserve"> </w:t>
-      </w:r>
+      <w:proofErr w:type="spellEnd"/>
+      <w:r>
+        <w:rPr>
+          <w:rFonts w:ascii="Times New Roman" w:eastAsia="Times New Roman" w:hAnsi="Times New Roman" w:cs="Times New Roman"/>
+          <w:b/>
+          <w:bCs/>
+          <w:sz w:val="24"/>
+          <w:szCs w:val="24"/>
+        </w:rPr>
+        <w:t xml:space="preserve"> </w:t>
+      </w:r>
+      <w:proofErr w:type="spellStart"/>
       <w:r>
         <w:rPr>
           <w:rFonts w:ascii="Nirmala UI" w:eastAsia="Times New Roman" w:hAnsi="Nirmala UI" w:cs="Nirmala UI"/>
@@ -3821,16 +4024,18 @@
         </w:rPr>
         <w:t>নিচের</w:t>
       </w:r>
-      <w:r>
-        <w:rPr>
-          <w:rFonts w:ascii="Times New Roman" w:eastAsia="Times New Roman" w:hAnsi="Times New Roman" w:cs="Times New Roman"/>
-          <w:b/>
-          <w:bCs/>
-          <w:sz w:val="24"/>
-          <w:szCs w:val="24"/>
-        </w:rPr>
-        <w:t xml:space="preserve"> </w:t>
-      </w:r>
+      <w:proofErr w:type="spellEnd"/>
+      <w:r>
+        <w:rPr>
+          <w:rFonts w:ascii="Times New Roman" w:eastAsia="Times New Roman" w:hAnsi="Times New Roman" w:cs="Times New Roman"/>
+          <w:b/>
+          <w:bCs/>
+          <w:sz w:val="24"/>
+          <w:szCs w:val="24"/>
+        </w:rPr>
+        <w:t xml:space="preserve"> </w:t>
+      </w:r>
+      <w:proofErr w:type="spellStart"/>
       <w:r>
         <w:rPr>
           <w:rFonts w:ascii="Nirmala UI" w:eastAsia="Times New Roman" w:hAnsi="Nirmala UI" w:cs="Nirmala UI"/>
@@ -3841,16 +4046,18 @@
         </w:rPr>
         <w:t>আইটেমগুলো</w:t>
       </w:r>
-      <w:r>
-        <w:rPr>
-          <w:rFonts w:ascii="Times New Roman" w:eastAsia="Times New Roman" w:hAnsi="Times New Roman" w:cs="Times New Roman"/>
-          <w:b/>
-          <w:bCs/>
-          <w:sz w:val="24"/>
-          <w:szCs w:val="24"/>
-        </w:rPr>
-        <w:t xml:space="preserve"> </w:t>
-      </w:r>
+      <w:proofErr w:type="spellEnd"/>
+      <w:r>
+        <w:rPr>
+          <w:rFonts w:ascii="Times New Roman" w:eastAsia="Times New Roman" w:hAnsi="Times New Roman" w:cs="Times New Roman"/>
+          <w:b/>
+          <w:bCs/>
+          <w:sz w:val="24"/>
+          <w:szCs w:val="24"/>
+        </w:rPr>
+        <w:t xml:space="preserve"> </w:t>
+      </w:r>
+      <w:proofErr w:type="spellStart"/>
       <w:r>
         <w:rPr>
           <w:rFonts w:ascii="Nirmala UI" w:eastAsia="Times New Roman" w:hAnsi="Nirmala UI" w:cs="Nirmala UI"/>
@@ -3861,16 +4068,18 @@
         </w:rPr>
         <w:t>যোগ</w:t>
       </w:r>
-      <w:r>
-        <w:rPr>
-          <w:rFonts w:ascii="Times New Roman" w:eastAsia="Times New Roman" w:hAnsi="Times New Roman" w:cs="Times New Roman"/>
-          <w:b/>
-          <w:bCs/>
-          <w:sz w:val="24"/>
-          <w:szCs w:val="24"/>
-        </w:rPr>
-        <w:t xml:space="preserve"> </w:t>
-      </w:r>
+      <w:proofErr w:type="spellEnd"/>
+      <w:r>
+        <w:rPr>
+          <w:rFonts w:ascii="Times New Roman" w:eastAsia="Times New Roman" w:hAnsi="Times New Roman" w:cs="Times New Roman"/>
+          <w:b/>
+          <w:bCs/>
+          <w:sz w:val="24"/>
+          <w:szCs w:val="24"/>
+        </w:rPr>
+        <w:t xml:space="preserve"> </w:t>
+      </w:r>
+      <w:proofErr w:type="spellStart"/>
       <w:r>
         <w:rPr>
           <w:rFonts w:ascii="Nirmala UI" w:eastAsia="Times New Roman" w:hAnsi="Nirmala UI" w:cs="Nirmala UI"/>
@@ -3881,6 +4090,7 @@
         </w:rPr>
         <w:t>করুন</w:t>
       </w:r>
+      <w:proofErr w:type="spellEnd"/>
       <w:r>
         <w:rPr>
           <w:rFonts w:ascii="Times New Roman" w:eastAsia="Times New Roman" w:hAnsi="Times New Roman" w:cs="Times New Roman"/>
@@ -4247,6 +4457,7 @@
           <w:szCs w:val="24"/>
         </w:rPr>
       </w:pPr>
+      <w:proofErr w:type="spellStart"/>
       <w:r>
         <w:rPr>
           <w:rFonts w:ascii="Nirmala UI" w:eastAsia="Times New Roman" w:hAnsi="Nirmala UI" w:cs="Nirmala UI"/>
@@ -4258,16 +4469,18 @@
         <w:lastRenderedPageBreak/>
         <w:t>সামারি</w:t>
       </w:r>
-      <w:r>
-        <w:rPr>
-          <w:rFonts w:ascii="Times New Roman" w:eastAsia="Times New Roman" w:hAnsi="Times New Roman" w:cs="Times New Roman"/>
-          <w:b/>
-          <w:bCs/>
-          <w:sz w:val="24"/>
-          <w:szCs w:val="24"/>
-        </w:rPr>
-        <w:t xml:space="preserve"> </w:t>
-      </w:r>
+      <w:proofErr w:type="spellEnd"/>
+      <w:r>
+        <w:rPr>
+          <w:rFonts w:ascii="Times New Roman" w:eastAsia="Times New Roman" w:hAnsi="Times New Roman" w:cs="Times New Roman"/>
+          <w:b/>
+          <w:bCs/>
+          <w:sz w:val="24"/>
+          <w:szCs w:val="24"/>
+        </w:rPr>
+        <w:t xml:space="preserve"> </w:t>
+      </w:r>
+      <w:proofErr w:type="spellStart"/>
       <w:r>
         <w:rPr>
           <w:rFonts w:ascii="Nirmala UI" w:eastAsia="Times New Roman" w:hAnsi="Nirmala UI" w:cs="Nirmala UI"/>
@@ -4278,16 +4491,18 @@
         </w:rPr>
         <w:t>ক্যালকুলেশন</w:t>
       </w:r>
-      <w:r>
-        <w:rPr>
-          <w:rFonts w:ascii="Times New Roman" w:eastAsia="Times New Roman" w:hAnsi="Times New Roman" w:cs="Times New Roman"/>
-          <w:b/>
-          <w:bCs/>
-          <w:sz w:val="24"/>
-          <w:szCs w:val="24"/>
-        </w:rPr>
-        <w:t xml:space="preserve"> </w:t>
-      </w:r>
+      <w:proofErr w:type="spellEnd"/>
+      <w:r>
+        <w:rPr>
+          <w:rFonts w:ascii="Times New Roman" w:eastAsia="Times New Roman" w:hAnsi="Times New Roman" w:cs="Times New Roman"/>
+          <w:b/>
+          <w:bCs/>
+          <w:sz w:val="24"/>
+          <w:szCs w:val="24"/>
+        </w:rPr>
+        <w:t xml:space="preserve"> </w:t>
+      </w:r>
+      <w:proofErr w:type="spellStart"/>
       <w:r>
         <w:rPr>
           <w:rFonts w:ascii="Nirmala UI" w:eastAsia="Times New Roman" w:hAnsi="Nirmala UI" w:cs="Nirmala UI"/>
@@ -4298,6 +4513,7 @@
         </w:rPr>
         <w:t>ভেরিফিকেশন</w:t>
       </w:r>
+      <w:proofErr w:type="spellEnd"/>
       <w:r>
         <w:rPr>
           <w:rFonts w:ascii="Times New Roman" w:eastAsia="Times New Roman" w:hAnsi="Times New Roman" w:cs="Times New Roman"/>
@@ -4308,6 +4524,7 @@
         </w:rPr>
         <w:t xml:space="preserve"> (</w:t>
       </w:r>
+      <w:proofErr w:type="spellStart"/>
       <w:r>
         <w:rPr>
           <w:rFonts w:ascii="Nirmala UI" w:eastAsia="Times New Roman" w:hAnsi="Nirmala UI" w:cs="Nirmala UI"/>
@@ -4318,16 +4535,18 @@
         </w:rPr>
         <w:t>ফর্ম</w:t>
       </w:r>
-      <w:r>
-        <w:rPr>
-          <w:rFonts w:ascii="Times New Roman" w:eastAsia="Times New Roman" w:hAnsi="Times New Roman" w:cs="Times New Roman"/>
-          <w:b/>
-          <w:bCs/>
-          <w:sz w:val="24"/>
-          <w:szCs w:val="24"/>
-        </w:rPr>
-        <w:t xml:space="preserve"> </w:t>
-      </w:r>
+      <w:proofErr w:type="spellEnd"/>
+      <w:r>
+        <w:rPr>
+          <w:rFonts w:ascii="Times New Roman" w:eastAsia="Times New Roman" w:hAnsi="Times New Roman" w:cs="Times New Roman"/>
+          <w:b/>
+          <w:bCs/>
+          <w:sz w:val="24"/>
+          <w:szCs w:val="24"/>
+        </w:rPr>
+        <w:t xml:space="preserve"> </w:t>
+      </w:r>
+      <w:proofErr w:type="spellStart"/>
       <w:r>
         <w:rPr>
           <w:rFonts w:ascii="Nirmala UI" w:eastAsia="Times New Roman" w:hAnsi="Nirmala UI" w:cs="Nirmala UI"/>
@@ -4338,16 +4557,18 @@
         </w:rPr>
         <w:t>নিজে</w:t>
       </w:r>
-      <w:r>
-        <w:rPr>
-          <w:rFonts w:ascii="Times New Roman" w:eastAsia="Times New Roman" w:hAnsi="Times New Roman" w:cs="Times New Roman"/>
-          <w:b/>
-          <w:bCs/>
-          <w:sz w:val="24"/>
-          <w:szCs w:val="24"/>
-        </w:rPr>
-        <w:t xml:space="preserve"> </w:t>
-      </w:r>
+      <w:proofErr w:type="spellEnd"/>
+      <w:r>
+        <w:rPr>
+          <w:rFonts w:ascii="Times New Roman" w:eastAsia="Times New Roman" w:hAnsi="Times New Roman" w:cs="Times New Roman"/>
+          <w:b/>
+          <w:bCs/>
+          <w:sz w:val="24"/>
+          <w:szCs w:val="24"/>
+        </w:rPr>
+        <w:t xml:space="preserve"> </w:t>
+      </w:r>
+      <w:proofErr w:type="spellStart"/>
       <w:r>
         <w:rPr>
           <w:rFonts w:ascii="Nirmala UI" w:eastAsia="Times New Roman" w:hAnsi="Nirmala UI" w:cs="Nirmala UI"/>
@@ -4358,16 +4579,18 @@
         </w:rPr>
         <w:t>নিজেই</w:t>
       </w:r>
-      <w:r>
-        <w:rPr>
-          <w:rFonts w:ascii="Times New Roman" w:eastAsia="Times New Roman" w:hAnsi="Times New Roman" w:cs="Times New Roman"/>
-          <w:b/>
-          <w:bCs/>
-          <w:sz w:val="24"/>
-          <w:szCs w:val="24"/>
-        </w:rPr>
-        <w:t xml:space="preserve"> </w:t>
-      </w:r>
+      <w:proofErr w:type="spellEnd"/>
+      <w:r>
+        <w:rPr>
+          <w:rFonts w:ascii="Times New Roman" w:eastAsia="Times New Roman" w:hAnsi="Times New Roman" w:cs="Times New Roman"/>
+          <w:b/>
+          <w:bCs/>
+          <w:sz w:val="24"/>
+          <w:szCs w:val="24"/>
+        </w:rPr>
+        <w:t xml:space="preserve"> </w:t>
+      </w:r>
+      <w:proofErr w:type="spellStart"/>
       <w:r>
         <w:rPr>
           <w:rFonts w:ascii="Nirmala UI" w:eastAsia="Times New Roman" w:hAnsi="Nirmala UI" w:cs="Nirmala UI"/>
@@ -4378,16 +4601,18 @@
         </w:rPr>
         <w:t>হিসাব</w:t>
       </w:r>
-      <w:r>
-        <w:rPr>
-          <w:rFonts w:ascii="Times New Roman" w:eastAsia="Times New Roman" w:hAnsi="Times New Roman" w:cs="Times New Roman"/>
-          <w:b/>
-          <w:bCs/>
-          <w:sz w:val="24"/>
-          <w:szCs w:val="24"/>
-        </w:rPr>
-        <w:t xml:space="preserve"> </w:t>
-      </w:r>
+      <w:proofErr w:type="spellEnd"/>
+      <w:r>
+        <w:rPr>
+          <w:rFonts w:ascii="Times New Roman" w:eastAsia="Times New Roman" w:hAnsi="Times New Roman" w:cs="Times New Roman"/>
+          <w:b/>
+          <w:bCs/>
+          <w:sz w:val="24"/>
+          <w:szCs w:val="24"/>
+        </w:rPr>
+        <w:t xml:space="preserve"> </w:t>
+      </w:r>
+      <w:proofErr w:type="spellStart"/>
       <w:r>
         <w:rPr>
           <w:rFonts w:ascii="Nirmala UI" w:eastAsia="Times New Roman" w:hAnsi="Nirmala UI" w:cs="Nirmala UI"/>
@@ -4398,6 +4623,7 @@
         </w:rPr>
         <w:t>করবে</w:t>
       </w:r>
+      <w:proofErr w:type="spellEnd"/>
       <w:r>
         <w:rPr>
           <w:rFonts w:ascii="Times New Roman" w:eastAsia="Times New Roman" w:hAnsi="Times New Roman" w:cs="Times New Roman"/>
@@ -4519,6 +4745,7 @@
         </w:rPr>
         <w:t xml:space="preserve"> (</w:t>
       </w:r>
+      <w:proofErr w:type="spellStart"/>
       <w:r>
         <w:rPr>
           <w:rFonts w:ascii="Nirmala UI" w:eastAsia="Times New Roman" w:hAnsi="Nirmala UI" w:cs="Nirmala UI"/>
@@ -4527,14 +4754,16 @@
         </w:rPr>
         <w:t>আপনি</w:t>
       </w:r>
-      <w:r>
-        <w:rPr>
-          <w:rFonts w:ascii="Times New Roman" w:eastAsia="Times New Roman" w:hAnsi="Times New Roman" w:cs="Times New Roman"/>
-          <w:sz w:val="24"/>
-          <w:szCs w:val="24"/>
-        </w:rPr>
-        <w:t xml:space="preserve"> </w:t>
-      </w:r>
+      <w:proofErr w:type="spellEnd"/>
+      <w:r>
+        <w:rPr>
+          <w:rFonts w:ascii="Times New Roman" w:eastAsia="Times New Roman" w:hAnsi="Times New Roman" w:cs="Times New Roman"/>
+          <w:sz w:val="24"/>
+          <w:szCs w:val="24"/>
+        </w:rPr>
+        <w:t xml:space="preserve"> </w:t>
+      </w:r>
+      <w:proofErr w:type="spellStart"/>
       <w:r>
         <w:rPr>
           <w:rFonts w:ascii="Nirmala UI" w:eastAsia="Times New Roman" w:hAnsi="Nirmala UI" w:cs="Nirmala UI"/>
@@ -4543,14 +4772,16 @@
         </w:rPr>
         <w:t>চাইলে</w:t>
       </w:r>
-      <w:r>
-        <w:rPr>
-          <w:rFonts w:ascii="Times New Roman" w:eastAsia="Times New Roman" w:hAnsi="Times New Roman" w:cs="Times New Roman"/>
-          <w:sz w:val="24"/>
-          <w:szCs w:val="24"/>
-        </w:rPr>
-        <w:t xml:space="preserve"> </w:t>
-      </w:r>
+      <w:proofErr w:type="spellEnd"/>
+      <w:r>
+        <w:rPr>
+          <w:rFonts w:ascii="Times New Roman" w:eastAsia="Times New Roman" w:hAnsi="Times New Roman" w:cs="Times New Roman"/>
+          <w:sz w:val="24"/>
+          <w:szCs w:val="24"/>
+        </w:rPr>
+        <w:t xml:space="preserve"> </w:t>
+      </w:r>
+      <w:proofErr w:type="spellStart"/>
       <w:r>
         <w:rPr>
           <w:rFonts w:ascii="Nirmala UI" w:eastAsia="Times New Roman" w:hAnsi="Nirmala UI" w:cs="Nirmala UI"/>
@@ -4559,14 +4790,16 @@
         </w:rPr>
         <w:t>কিছু</w:t>
       </w:r>
-      <w:r>
-        <w:rPr>
-          <w:rFonts w:ascii="Times New Roman" w:eastAsia="Times New Roman" w:hAnsi="Times New Roman" w:cs="Times New Roman"/>
-          <w:sz w:val="24"/>
-          <w:szCs w:val="24"/>
-        </w:rPr>
-        <w:t xml:space="preserve"> </w:t>
-      </w:r>
+      <w:proofErr w:type="spellEnd"/>
+      <w:r>
+        <w:rPr>
+          <w:rFonts w:ascii="Times New Roman" w:eastAsia="Times New Roman" w:hAnsi="Times New Roman" w:cs="Times New Roman"/>
+          <w:sz w:val="24"/>
+          <w:szCs w:val="24"/>
+        </w:rPr>
+        <w:t xml:space="preserve"> </w:t>
+      </w:r>
+      <w:proofErr w:type="spellStart"/>
       <w:r>
         <w:rPr>
           <w:rFonts w:ascii="Nirmala UI" w:eastAsia="Times New Roman" w:hAnsi="Nirmala UI" w:cs="Nirmala UI"/>
@@ -4591,14 +4824,16 @@
         </w:rPr>
         <w:t>বাড়ানোর</w:t>
       </w:r>
-      <w:r>
-        <w:rPr>
-          <w:rFonts w:ascii="Times New Roman" w:eastAsia="Times New Roman" w:hAnsi="Times New Roman" w:cs="Times New Roman"/>
-          <w:sz w:val="24"/>
-          <w:szCs w:val="24"/>
-        </w:rPr>
-        <w:t xml:space="preserve"> </w:t>
-      </w:r>
+      <w:proofErr w:type="spellEnd"/>
+      <w:r>
+        <w:rPr>
+          <w:rFonts w:ascii="Times New Roman" w:eastAsia="Times New Roman" w:hAnsi="Times New Roman" w:cs="Times New Roman"/>
+          <w:sz w:val="24"/>
+          <w:szCs w:val="24"/>
+        </w:rPr>
+        <w:t xml:space="preserve"> </w:t>
+      </w:r>
+      <w:proofErr w:type="spellStart"/>
       <w:r>
         <w:rPr>
           <w:rFonts w:ascii="Nirmala UI" w:eastAsia="Times New Roman" w:hAnsi="Nirmala UI" w:cs="Nirmala UI"/>
@@ -4607,14 +4842,16 @@
         </w:rPr>
         <w:t>জন্য</w:t>
       </w:r>
-      <w:r>
-        <w:rPr>
-          <w:rFonts w:ascii="Times New Roman" w:eastAsia="Times New Roman" w:hAnsi="Times New Roman" w:cs="Times New Roman"/>
-          <w:sz w:val="24"/>
-          <w:szCs w:val="24"/>
-        </w:rPr>
-        <w:t xml:space="preserve"> </w:t>
-      </w:r>
+      <w:proofErr w:type="spellEnd"/>
+      <w:r>
+        <w:rPr>
+          <w:rFonts w:ascii="Times New Roman" w:eastAsia="Times New Roman" w:hAnsi="Times New Roman" w:cs="Times New Roman"/>
+          <w:sz w:val="24"/>
+          <w:szCs w:val="24"/>
+        </w:rPr>
+        <w:t xml:space="preserve"> </w:t>
+      </w:r>
+      <w:proofErr w:type="spellStart"/>
       <w:r>
         <w:rPr>
           <w:rFonts w:ascii="Nirmala UI" w:eastAsia="Times New Roman" w:hAnsi="Nirmala UI" w:cs="Nirmala UI"/>
@@ -4623,14 +4860,16 @@
         </w:rPr>
         <w:t>দিতে</w:t>
       </w:r>
-      <w:r>
-        <w:rPr>
-          <w:rFonts w:ascii="Times New Roman" w:eastAsia="Times New Roman" w:hAnsi="Times New Roman" w:cs="Times New Roman"/>
-          <w:sz w:val="24"/>
-          <w:szCs w:val="24"/>
-        </w:rPr>
-        <w:t xml:space="preserve"> </w:t>
-      </w:r>
+      <w:proofErr w:type="spellEnd"/>
+      <w:r>
+        <w:rPr>
+          <w:rFonts w:ascii="Times New Roman" w:eastAsia="Times New Roman" w:hAnsi="Times New Roman" w:cs="Times New Roman"/>
+          <w:sz w:val="24"/>
+          <w:szCs w:val="24"/>
+        </w:rPr>
+        <w:t xml:space="preserve"> </w:t>
+      </w:r>
+      <w:proofErr w:type="spellStart"/>
       <w:r>
         <w:rPr>
           <w:rFonts w:ascii="Nirmala UI" w:eastAsia="Times New Roman" w:hAnsi="Nirmala UI" w:cs="Nirmala UI"/>
@@ -4639,6 +4878,7 @@
         </w:rPr>
         <w:t>পারেন</w:t>
       </w:r>
+      <w:proofErr w:type="spellEnd"/>
       <w:r>
         <w:rPr>
           <w:rFonts w:ascii="Times New Roman" w:eastAsia="Times New Roman" w:hAnsi="Times New Roman" w:cs="Times New Roman"/>
@@ -4699,6 +4939,7 @@
           <w:szCs w:val="24"/>
         </w:rPr>
       </w:pPr>
+      <w:proofErr w:type="spellStart"/>
       <w:r>
         <w:rPr>
           <w:rFonts w:ascii="Nirmala UI" w:eastAsia="Times New Roman" w:hAnsi="Nirmala UI" w:cs="Nirmala UI"/>
@@ -4707,14 +4948,16 @@
         </w:rPr>
         <w:t>এই</w:t>
       </w:r>
-      <w:r>
-        <w:rPr>
-          <w:rFonts w:ascii="Times New Roman" w:eastAsia="Times New Roman" w:hAnsi="Times New Roman" w:cs="Times New Roman"/>
-          <w:sz w:val="24"/>
-          <w:szCs w:val="24"/>
-        </w:rPr>
-        <w:t xml:space="preserve"> </w:t>
-      </w:r>
+      <w:proofErr w:type="spellEnd"/>
+      <w:r>
+        <w:rPr>
+          <w:rFonts w:ascii="Times New Roman" w:eastAsia="Times New Roman" w:hAnsi="Times New Roman" w:cs="Times New Roman"/>
+          <w:sz w:val="24"/>
+          <w:szCs w:val="24"/>
+        </w:rPr>
+        <w:t xml:space="preserve"> </w:t>
+      </w:r>
+      <w:proofErr w:type="spellStart"/>
       <w:r>
         <w:rPr>
           <w:rFonts w:ascii="Nirmala UI" w:eastAsia="Times New Roman" w:hAnsi="Nirmala UI" w:cs="Nirmala UI"/>
@@ -4723,14 +4966,16 @@
         </w:rPr>
         <w:t>ডেটাগুলো</w:t>
       </w:r>
-      <w:r>
-        <w:rPr>
-          <w:rFonts w:ascii="Times New Roman" w:eastAsia="Times New Roman" w:hAnsi="Times New Roman" w:cs="Times New Roman"/>
-          <w:sz w:val="24"/>
-          <w:szCs w:val="24"/>
-        </w:rPr>
-        <w:t xml:space="preserve"> </w:t>
-      </w:r>
+      <w:proofErr w:type="spellEnd"/>
+      <w:r>
+        <w:rPr>
+          <w:rFonts w:ascii="Times New Roman" w:eastAsia="Times New Roman" w:hAnsi="Times New Roman" w:cs="Times New Roman"/>
+          <w:sz w:val="24"/>
+          <w:szCs w:val="24"/>
+        </w:rPr>
+        <w:t xml:space="preserve"> </w:t>
+      </w:r>
+      <w:proofErr w:type="spellStart"/>
       <w:r>
         <w:rPr>
           <w:rFonts w:ascii="Nirmala UI" w:eastAsia="Times New Roman" w:hAnsi="Nirmala UI" w:cs="Nirmala UI"/>
@@ -4739,14 +4984,16 @@
         </w:rPr>
         <w:t>দিয়ে</w:t>
       </w:r>
-      <w:r>
-        <w:rPr>
-          <w:rFonts w:ascii="Times New Roman" w:eastAsia="Times New Roman" w:hAnsi="Times New Roman" w:cs="Times New Roman"/>
-          <w:sz w:val="24"/>
-          <w:szCs w:val="24"/>
-        </w:rPr>
-        <w:t xml:space="preserve"> </w:t>
-      </w:r>
+      <w:proofErr w:type="spellEnd"/>
+      <w:r>
+        <w:rPr>
+          <w:rFonts w:ascii="Times New Roman" w:eastAsia="Times New Roman" w:hAnsi="Times New Roman" w:cs="Times New Roman"/>
+          <w:sz w:val="24"/>
+          <w:szCs w:val="24"/>
+        </w:rPr>
+        <w:t xml:space="preserve"> </w:t>
+      </w:r>
+      <w:proofErr w:type="spellStart"/>
       <w:r>
         <w:rPr>
           <w:rFonts w:ascii="Nirmala UI" w:eastAsia="Times New Roman" w:hAnsi="Nirmala UI" w:cs="Nirmala UI"/>
@@ -4755,14 +5002,16 @@
         </w:rPr>
         <w:t>ফর্মগুলো</w:t>
       </w:r>
-      <w:r>
-        <w:rPr>
-          <w:rFonts w:ascii="Times New Roman" w:eastAsia="Times New Roman" w:hAnsi="Times New Roman" w:cs="Times New Roman"/>
-          <w:sz w:val="24"/>
-          <w:szCs w:val="24"/>
-        </w:rPr>
-        <w:t xml:space="preserve"> </w:t>
-      </w:r>
+      <w:proofErr w:type="spellEnd"/>
+      <w:r>
+        <w:rPr>
+          <w:rFonts w:ascii="Times New Roman" w:eastAsia="Times New Roman" w:hAnsi="Times New Roman" w:cs="Times New Roman"/>
+          <w:sz w:val="24"/>
+          <w:szCs w:val="24"/>
+        </w:rPr>
+        <w:t xml:space="preserve"> </w:t>
+      </w:r>
+      <w:proofErr w:type="spellStart"/>
       <w:r>
         <w:rPr>
           <w:rFonts w:ascii="Nirmala UI" w:eastAsia="Times New Roman" w:hAnsi="Nirmala UI" w:cs="Nirmala UI"/>
@@ -4771,14 +5020,16 @@
         </w:rPr>
         <w:t>সাবমিট</w:t>
       </w:r>
-      <w:r>
-        <w:rPr>
-          <w:rFonts w:ascii="Times New Roman" w:eastAsia="Times New Roman" w:hAnsi="Times New Roman" w:cs="Times New Roman"/>
-          <w:sz w:val="24"/>
-          <w:szCs w:val="24"/>
-        </w:rPr>
-        <w:t xml:space="preserve"> </w:t>
-      </w:r>
+      <w:proofErr w:type="spellEnd"/>
+      <w:r>
+        <w:rPr>
+          <w:rFonts w:ascii="Times New Roman" w:eastAsia="Times New Roman" w:hAnsi="Times New Roman" w:cs="Times New Roman"/>
+          <w:sz w:val="24"/>
+          <w:szCs w:val="24"/>
+        </w:rPr>
+        <w:t xml:space="preserve"> </w:t>
+      </w:r>
+      <w:proofErr w:type="spellStart"/>
       <w:r>
         <w:rPr>
           <w:rFonts w:ascii="Nirmala UI" w:eastAsia="Times New Roman" w:hAnsi="Nirmala UI" w:cs="Nirmala UI"/>
@@ -4787,14 +5038,16 @@
         </w:rPr>
         <w:t>করে</w:t>
       </w:r>
-      <w:r>
-        <w:rPr>
-          <w:rFonts w:ascii="Times New Roman" w:eastAsia="Times New Roman" w:hAnsi="Times New Roman" w:cs="Times New Roman"/>
-          <w:sz w:val="24"/>
-          <w:szCs w:val="24"/>
-        </w:rPr>
-        <w:t xml:space="preserve"> </w:t>
-      </w:r>
+      <w:proofErr w:type="spellEnd"/>
+      <w:r>
+        <w:rPr>
+          <w:rFonts w:ascii="Times New Roman" w:eastAsia="Times New Roman" w:hAnsi="Times New Roman" w:cs="Times New Roman"/>
+          <w:sz w:val="24"/>
+          <w:szCs w:val="24"/>
+        </w:rPr>
+        <w:t xml:space="preserve"> </w:t>
+      </w:r>
+      <w:proofErr w:type="spellStart"/>
       <w:r>
         <w:rPr>
           <w:rFonts w:ascii="Nirmala UI" w:eastAsia="Times New Roman" w:hAnsi="Nirmala UI" w:cs="Nirmala UI"/>
@@ -4803,14 +5056,16 @@
         </w:rPr>
         <w:t>চেক</w:t>
       </w:r>
-      <w:r>
-        <w:rPr>
-          <w:rFonts w:ascii="Times New Roman" w:eastAsia="Times New Roman" w:hAnsi="Times New Roman" w:cs="Times New Roman"/>
-          <w:sz w:val="24"/>
-          <w:szCs w:val="24"/>
-        </w:rPr>
-        <w:t xml:space="preserve"> </w:t>
-      </w:r>
+      <w:proofErr w:type="spellEnd"/>
+      <w:r>
+        <w:rPr>
+          <w:rFonts w:ascii="Times New Roman" w:eastAsia="Times New Roman" w:hAnsi="Times New Roman" w:cs="Times New Roman"/>
+          <w:sz w:val="24"/>
+          <w:szCs w:val="24"/>
+        </w:rPr>
+        <w:t xml:space="preserve"> </w:t>
+      </w:r>
+      <w:proofErr w:type="spellStart"/>
       <w:r>
         <w:rPr>
           <w:rFonts w:ascii="Nirmala UI" w:eastAsia="Times New Roman" w:hAnsi="Nirmala UI" w:cs="Nirmala UI"/>
@@ -4819,14 +5074,16 @@
         </w:rPr>
         <w:t>করে</w:t>
       </w:r>
-      <w:r>
-        <w:rPr>
-          <w:rFonts w:ascii="Times New Roman" w:eastAsia="Times New Roman" w:hAnsi="Times New Roman" w:cs="Times New Roman"/>
-          <w:sz w:val="24"/>
-          <w:szCs w:val="24"/>
-        </w:rPr>
-        <w:t xml:space="preserve"> </w:t>
-      </w:r>
+      <w:proofErr w:type="spellEnd"/>
+      <w:r>
+        <w:rPr>
+          <w:rFonts w:ascii="Times New Roman" w:eastAsia="Times New Roman" w:hAnsi="Times New Roman" w:cs="Times New Roman"/>
+          <w:sz w:val="24"/>
+          <w:szCs w:val="24"/>
+        </w:rPr>
+        <w:t xml:space="preserve"> </w:t>
+      </w:r>
+      <w:proofErr w:type="spellStart"/>
       <w:r>
         <w:rPr>
           <w:rFonts w:ascii="Nirmala UI" w:eastAsia="Times New Roman" w:hAnsi="Nirmala UI" w:cs="Nirmala UI"/>
@@ -4835,6 +5092,7 @@
         </w:rPr>
         <w:t>দেখুন</w:t>
       </w:r>
+      <w:proofErr w:type="spellEnd"/>
       <w:r>
         <w:rPr>
           <w:rFonts w:ascii="Times New Roman" w:eastAsia="Times New Roman" w:hAnsi="Times New Roman" w:cs="Times New Roman"/>
@@ -4843,6 +5101,7 @@
         </w:rPr>
         <w:t xml:space="preserve">, </w:t>
       </w:r>
+      <w:proofErr w:type="spellStart"/>
       <w:r>
         <w:rPr>
           <w:rFonts w:ascii="Nirmala UI" w:eastAsia="Times New Roman" w:hAnsi="Nirmala UI" w:cs="Nirmala UI"/>
@@ -4851,14 +5110,16 @@
         </w:rPr>
         <w:t>সব</w:t>
       </w:r>
-      <w:r>
-        <w:rPr>
-          <w:rFonts w:ascii="Times New Roman" w:eastAsia="Times New Roman" w:hAnsi="Times New Roman" w:cs="Times New Roman"/>
-          <w:sz w:val="24"/>
-          <w:szCs w:val="24"/>
-        </w:rPr>
-        <w:t xml:space="preserve"> </w:t>
-      </w:r>
+      <w:proofErr w:type="spellEnd"/>
+      <w:r>
+        <w:rPr>
+          <w:rFonts w:ascii="Times New Roman" w:eastAsia="Times New Roman" w:hAnsi="Times New Roman" w:cs="Times New Roman"/>
+          <w:sz w:val="24"/>
+          <w:szCs w:val="24"/>
+        </w:rPr>
+        <w:t xml:space="preserve"> </w:t>
+      </w:r>
+      <w:proofErr w:type="spellStart"/>
       <w:r>
         <w:rPr>
           <w:rFonts w:ascii="Nirmala UI" w:eastAsia="Times New Roman" w:hAnsi="Nirmala UI" w:cs="Nirmala UI"/>
@@ -4867,14 +5128,16 @@
         </w:rPr>
         <w:t>ডেটা</w:t>
       </w:r>
-      <w:r>
-        <w:rPr>
-          <w:rFonts w:ascii="Times New Roman" w:eastAsia="Times New Roman" w:hAnsi="Times New Roman" w:cs="Times New Roman"/>
-          <w:sz w:val="24"/>
-          <w:szCs w:val="24"/>
-        </w:rPr>
-        <w:t xml:space="preserve"> </w:t>
-      </w:r>
+      <w:proofErr w:type="spellEnd"/>
+      <w:r>
+        <w:rPr>
+          <w:rFonts w:ascii="Times New Roman" w:eastAsia="Times New Roman" w:hAnsi="Times New Roman" w:cs="Times New Roman"/>
+          <w:sz w:val="24"/>
+          <w:szCs w:val="24"/>
+        </w:rPr>
+        <w:t xml:space="preserve"> </w:t>
+      </w:r>
+      <w:proofErr w:type="spellStart"/>
       <w:r>
         <w:rPr>
           <w:rFonts w:ascii="Nirmala UI" w:eastAsia="Times New Roman" w:hAnsi="Nirmala UI" w:cs="Nirmala UI"/>
@@ -4883,14 +5146,16 @@
         </w:rPr>
         <w:t>সঠিকভাবে</w:t>
       </w:r>
-      <w:r>
-        <w:rPr>
-          <w:rFonts w:ascii="Times New Roman" w:eastAsia="Times New Roman" w:hAnsi="Times New Roman" w:cs="Times New Roman"/>
-          <w:sz w:val="24"/>
-          <w:szCs w:val="24"/>
-        </w:rPr>
-        <w:t xml:space="preserve"> </w:t>
-      </w:r>
+      <w:proofErr w:type="spellEnd"/>
+      <w:r>
+        <w:rPr>
+          <w:rFonts w:ascii="Times New Roman" w:eastAsia="Times New Roman" w:hAnsi="Times New Roman" w:cs="Times New Roman"/>
+          <w:sz w:val="24"/>
+          <w:szCs w:val="24"/>
+        </w:rPr>
+        <w:t xml:space="preserve"> </w:t>
+      </w:r>
+      <w:proofErr w:type="spellStart"/>
       <w:r>
         <w:rPr>
           <w:rFonts w:ascii="Nirmala UI" w:eastAsia="Times New Roman" w:hAnsi="Nirmala UI" w:cs="Nirmala UI"/>
@@ -4899,14 +5164,16 @@
         </w:rPr>
         <w:t>ডাটাবেজে</w:t>
       </w:r>
-      <w:r>
-        <w:rPr>
-          <w:rFonts w:ascii="Times New Roman" w:eastAsia="Times New Roman" w:hAnsi="Times New Roman" w:cs="Times New Roman"/>
-          <w:sz w:val="24"/>
-          <w:szCs w:val="24"/>
-        </w:rPr>
-        <w:t xml:space="preserve"> </w:t>
-      </w:r>
+      <w:proofErr w:type="spellEnd"/>
+      <w:r>
+        <w:rPr>
+          <w:rFonts w:ascii="Times New Roman" w:eastAsia="Times New Roman" w:hAnsi="Times New Roman" w:cs="Times New Roman"/>
+          <w:sz w:val="24"/>
+          <w:szCs w:val="24"/>
+        </w:rPr>
+        <w:t xml:space="preserve"> </w:t>
+      </w:r>
+      <w:proofErr w:type="spellStart"/>
       <w:r>
         <w:rPr>
           <w:rFonts w:ascii="Nirmala UI" w:eastAsia="Times New Roman" w:hAnsi="Nirmala UI" w:cs="Nirmala UI"/>
@@ -4915,14 +5182,16 @@
         </w:rPr>
         <w:t>সেভ</w:t>
       </w:r>
-      <w:r>
-        <w:rPr>
-          <w:rFonts w:ascii="Times New Roman" w:eastAsia="Times New Roman" w:hAnsi="Times New Roman" w:cs="Times New Roman"/>
-          <w:sz w:val="24"/>
-          <w:szCs w:val="24"/>
-        </w:rPr>
-        <w:t xml:space="preserve"> </w:t>
-      </w:r>
+      <w:proofErr w:type="spellEnd"/>
+      <w:r>
+        <w:rPr>
+          <w:rFonts w:ascii="Times New Roman" w:eastAsia="Times New Roman" w:hAnsi="Times New Roman" w:cs="Times New Roman"/>
+          <w:sz w:val="24"/>
+          <w:szCs w:val="24"/>
+        </w:rPr>
+        <w:t xml:space="preserve"> </w:t>
+      </w:r>
+      <w:proofErr w:type="spellStart"/>
       <w:r>
         <w:rPr>
           <w:rFonts w:ascii="Nirmala UI" w:eastAsia="Times New Roman" w:hAnsi="Nirmala UI" w:cs="Nirmala UI"/>
@@ -4931,21 +5200,32 @@
         </w:rPr>
         <w:t>হচ্ছে</w:t>
       </w:r>
-      <w:r>
-        <w:rPr>
-          <w:rFonts w:ascii="Times New Roman" w:eastAsia="Times New Roman" w:hAnsi="Times New Roman" w:cs="Times New Roman"/>
-          <w:sz w:val="24"/>
-          <w:szCs w:val="24"/>
-        </w:rPr>
-        <w:t xml:space="preserve"> </w:t>
-      </w:r>
-      <w:r>
-        <w:rPr>
-          <w:rFonts w:ascii="Nirmala UI" w:eastAsia="Times New Roman" w:hAnsi="Nirmala UI" w:cs="Nirmala UI"/>
-          <w:sz w:val="24"/>
-          <w:szCs w:val="24"/>
-        </w:rPr>
-        <w:t>কিনা।</w:t>
+      <w:proofErr w:type="spellEnd"/>
+      <w:r>
+        <w:rPr>
+          <w:rFonts w:ascii="Times New Roman" w:eastAsia="Times New Roman" w:hAnsi="Times New Roman" w:cs="Times New Roman"/>
+          <w:sz w:val="24"/>
+          <w:szCs w:val="24"/>
+        </w:rPr>
+        <w:t xml:space="preserve"> </w:t>
+      </w:r>
+      <w:proofErr w:type="spellStart"/>
+      <w:r>
+        <w:rPr>
+          <w:rFonts w:ascii="Nirmala UI" w:eastAsia="Times New Roman" w:hAnsi="Nirmala UI" w:cs="Nirmala UI"/>
+          <w:sz w:val="24"/>
+          <w:szCs w:val="24"/>
+        </w:rPr>
+        <w:t>কিনা</w:t>
+      </w:r>
+      <w:proofErr w:type="spellEnd"/>
+      <w:r>
+        <w:rPr>
+          <w:rFonts w:ascii="Nirmala UI" w:eastAsia="Times New Roman" w:hAnsi="Nirmala UI" w:cs="Nirmala UI"/>
+          <w:sz w:val="24"/>
+          <w:szCs w:val="24"/>
+        </w:rPr>
+        <w:t>।</w:t>
       </w:r>
     </w:p>
     <w:p/>

</xml_diff>

<commit_message>
Laundry Payment Page Added
</commit_message>
<xml_diff>
--- a/src/HotelRestaurant.Infrastructure/SQL/MasterDataa.docx
+++ b/src/HotelRestaurant.Infrastructure/SQL/MasterDataa.docx
@@ -12632,6 +12632,97 @@
           <w:szCs w:val="27"/>
         </w:rPr>
       </w:pPr>
+    </w:p>
+    <w:p>
+      <w:pPr>
+        <w:spacing w:before="100" w:beforeAutospacing="1" w:after="100" w:afterAutospacing="1" w:line="240" w:lineRule="auto"/>
+        <w:outlineLvl w:val="2"/>
+        <w:rPr>
+          <w:rFonts w:ascii="Times New Roman" w:eastAsia="Times New Roman" w:hAnsi="Times New Roman" w:cs="Times New Roman"/>
+          <w:b/>
+          <w:bCs/>
+          <w:sz w:val="27"/>
+          <w:szCs w:val="27"/>
+        </w:rPr>
+      </w:pPr>
+    </w:p>
+    <w:p>
+      <w:pPr>
+        <w:spacing w:before="100" w:beforeAutospacing="1" w:after="100" w:afterAutospacing="1" w:line="240" w:lineRule="auto"/>
+        <w:outlineLvl w:val="2"/>
+        <w:rPr>
+          <w:rFonts w:ascii="Times New Roman" w:eastAsia="Times New Roman" w:hAnsi="Times New Roman" w:cs="Times New Roman"/>
+          <w:b/>
+          <w:bCs/>
+          <w:sz w:val="27"/>
+          <w:szCs w:val="27"/>
+        </w:rPr>
+      </w:pPr>
+    </w:p>
+    <w:p>
+      <w:pPr>
+        <w:spacing w:before="100" w:beforeAutospacing="1" w:after="100" w:afterAutospacing="1" w:line="240" w:lineRule="auto"/>
+        <w:outlineLvl w:val="2"/>
+        <w:rPr>
+          <w:rFonts w:ascii="Times New Roman" w:eastAsia="Times New Roman" w:hAnsi="Times New Roman" w:cs="Times New Roman"/>
+          <w:b/>
+          <w:bCs/>
+          <w:sz w:val="27"/>
+          <w:szCs w:val="27"/>
+        </w:rPr>
+      </w:pPr>
+    </w:p>
+    <w:p>
+      <w:pPr>
+        <w:spacing w:before="100" w:beforeAutospacing="1" w:after="100" w:afterAutospacing="1" w:line="240" w:lineRule="auto"/>
+        <w:outlineLvl w:val="2"/>
+        <w:rPr>
+          <w:rFonts w:ascii="Times New Roman" w:eastAsia="Times New Roman" w:hAnsi="Times New Roman" w:cs="Times New Roman"/>
+          <w:b/>
+          <w:bCs/>
+          <w:sz w:val="27"/>
+          <w:szCs w:val="27"/>
+        </w:rPr>
+      </w:pPr>
+    </w:p>
+    <w:p>
+      <w:pPr>
+        <w:spacing w:before="100" w:beforeAutospacing="1" w:after="100" w:afterAutospacing="1" w:line="240" w:lineRule="auto"/>
+        <w:outlineLvl w:val="2"/>
+        <w:rPr>
+          <w:rFonts w:ascii="Times New Roman" w:eastAsia="Times New Roman" w:hAnsi="Times New Roman" w:cs="Times New Roman"/>
+          <w:b/>
+          <w:bCs/>
+          <w:sz w:val="27"/>
+          <w:szCs w:val="27"/>
+        </w:rPr>
+      </w:pPr>
+    </w:p>
+    <w:p>
+      <w:pPr>
+        <w:spacing w:before="100" w:beforeAutospacing="1" w:after="100" w:afterAutospacing="1" w:line="240" w:lineRule="auto"/>
+        <w:outlineLvl w:val="2"/>
+        <w:rPr>
+          <w:rFonts w:ascii="Times New Roman" w:eastAsia="Times New Roman" w:hAnsi="Times New Roman" w:cs="Times New Roman"/>
+          <w:b/>
+          <w:bCs/>
+          <w:sz w:val="27"/>
+          <w:szCs w:val="27"/>
+        </w:rPr>
+      </w:pPr>
+    </w:p>
+    <w:p>
+      <w:pPr>
+        <w:spacing w:before="100" w:beforeAutospacing="1" w:after="100" w:afterAutospacing="1" w:line="240" w:lineRule="auto"/>
+        <w:outlineLvl w:val="2"/>
+        <w:rPr>
+          <w:rFonts w:ascii="Times New Roman" w:eastAsia="Times New Roman" w:hAnsi="Times New Roman" w:cs="Times New Roman"/>
+          <w:b/>
+          <w:bCs/>
+          <w:sz w:val="27"/>
+          <w:szCs w:val="27"/>
+        </w:rPr>
+      </w:pPr>
       <w:r>
         <w:rPr>
           <w:rFonts w:ascii="Cambria" w:eastAsia="Times New Roman" w:hAnsi="Cambria" w:cs="Cambria"/>
@@ -12640,6 +12731,7 @@
           <w:sz w:val="27"/>
           <w:szCs w:val="27"/>
         </w:rPr>
+        <w:lastRenderedPageBreak/>
         <w:t>🍽️</w:t>
       </w:r>
       <w:r>
@@ -13179,7 +13271,6 @@
                 <w:rFonts w:ascii="Courier New" w:eastAsia="Times New Roman" w:hAnsi="Courier New" w:cs="Courier New"/>
                 <w:sz w:val="20"/>
               </w:rPr>
-              <w:lastRenderedPageBreak/>
               <w:t>Cloth Napkins (Satin)</w:t>
             </w:r>
           </w:p>
@@ -13370,6 +13461,1296 @@
                 <w:szCs w:val="24"/>
               </w:rPr>
               <w:t>Folded and prepped for the evening corporate banquet event.</w:t>
+            </w:r>
+          </w:p>
+        </w:tc>
+      </w:tr>
+    </w:tbl>
+    <w:p>
+      <w:pPr>
+        <w:spacing w:before="100" w:beforeAutospacing="1" w:after="100" w:afterAutospacing="1" w:line="240" w:lineRule="auto"/>
+        <w:rPr>
+          <w:rFonts w:ascii="Times New Roman" w:eastAsia="Times New Roman" w:hAnsi="Times New Roman" w:cs="Times New Roman"/>
+          <w:sz w:val="24"/>
+          <w:szCs w:val="24"/>
+        </w:rPr>
+      </w:pPr>
+      <w:r>
+        <w:rPr>
+          <w:rFonts w:ascii="Times New Roman" w:eastAsia="Times New Roman" w:hAnsi="Times New Roman" w:cs="Times New Roman"/>
+          <w:sz w:val="24"/>
+          <w:szCs w:val="24"/>
+        </w:rPr>
+        <w:t xml:space="preserve">Here is a set of realistic, production-ready mock data you can use to test your </w:t>
+      </w:r>
+      <w:r>
+        <w:rPr>
+          <w:rFonts w:ascii="Times New Roman" w:eastAsia="Times New Roman" w:hAnsi="Times New Roman" w:cs="Times New Roman"/>
+          <w:b/>
+          <w:bCs/>
+          <w:sz w:val="24"/>
+          <w:szCs w:val="24"/>
+        </w:rPr>
+        <w:t>Laundry Payment Tracking</w:t>
+      </w:r>
+      <w:r>
+        <w:rPr>
+          <w:rFonts w:ascii="Times New Roman" w:eastAsia="Times New Roman" w:hAnsi="Times New Roman" w:cs="Times New Roman"/>
+          <w:sz w:val="24"/>
+          <w:szCs w:val="24"/>
+        </w:rPr>
+        <w:t xml:space="preserve"> screen.</w:t>
+      </w:r>
+    </w:p>
+    <w:p>
+      <w:pPr>
+        <w:spacing w:before="100" w:beforeAutospacing="1" w:after="100" w:afterAutospacing="1" w:line="240" w:lineRule="auto"/>
+        <w:rPr>
+          <w:rFonts w:ascii="Times New Roman" w:eastAsia="Times New Roman" w:hAnsi="Times New Roman" w:cs="Times New Roman"/>
+          <w:sz w:val="24"/>
+          <w:szCs w:val="24"/>
+        </w:rPr>
+      </w:pPr>
+      <w:r>
+        <w:rPr>
+          <w:rFonts w:ascii="Times New Roman" w:eastAsia="Times New Roman" w:hAnsi="Times New Roman" w:cs="Times New Roman"/>
+          <w:sz w:val="24"/>
+          <w:szCs w:val="24"/>
+        </w:rPr>
+        <w:t>These entries cover various operational cases like fully settled balances, pending due amounts, and multiple laundry vendors to verify that your layout and conditional color styles look perfect.</w:t>
+      </w:r>
+    </w:p>
+    <w:p>
+      <w:pPr>
+        <w:spacing w:before="100" w:beforeAutospacing="1" w:after="100" w:afterAutospacing="1" w:line="240" w:lineRule="auto"/>
+        <w:outlineLvl w:val="2"/>
+        <w:rPr>
+          <w:rFonts w:ascii="Times New Roman" w:eastAsia="Times New Roman" w:hAnsi="Times New Roman" w:cs="Times New Roman"/>
+          <w:b/>
+          <w:bCs/>
+          <w:sz w:val="27"/>
+          <w:szCs w:val="27"/>
+        </w:rPr>
+      </w:pPr>
+      <w:r>
+        <w:rPr>
+          <w:rFonts w:ascii="Times New Roman" w:eastAsia="Times New Roman" w:hAnsi="Times New Roman" w:cs="Times New Roman"/>
+          <w:b/>
+          <w:bCs/>
+          <w:sz w:val="27"/>
+          <w:szCs w:val="27"/>
+        </w:rPr>
+        <w:t>📋 Mock Entries for Fast Testing</w:t>
+      </w:r>
+    </w:p>
+    <w:tbl>
+      <w:tblPr>
+        <w:tblW w:w="0" w:type="auto"/>
+        <w:tblCellSpacing w:w="15" w:type="dxa"/>
+        <w:tblCellMar>
+          <w:top w:w="15" w:type="dxa"/>
+          <w:left w:w="15" w:type="dxa"/>
+          <w:bottom w:w="15" w:type="dxa"/>
+          <w:right w:w="15" w:type="dxa"/>
+        </w:tblCellMar>
+        <w:tblLook w:val="04A0"/>
+      </w:tblPr>
+      <w:tblGrid>
+        <w:gridCol w:w="2447"/>
+        <w:gridCol w:w="2312"/>
+        <w:gridCol w:w="2329"/>
+        <w:gridCol w:w="2722"/>
+      </w:tblGrid>
+      <w:tr>
+        <w:trPr>
+          <w:tblHeader/>
+          <w:tblCellSpacing w:w="15" w:type="dxa"/>
+        </w:trPr>
+        <w:tc>
+          <w:tcPr>
+            <w:tcW w:w="0" w:type="auto"/>
+            <w:tcBorders>
+              <w:top w:val="single" w:sz="6" w:space="0" w:color="C4C7C5"/>
+              <w:left w:val="single" w:sz="6" w:space="0" w:color="C4C7C5"/>
+              <w:bottom w:val="single" w:sz="6" w:space="0" w:color="C4C7C5"/>
+              <w:right w:val="single" w:sz="6" w:space="0" w:color="C4C7C5"/>
+            </w:tcBorders>
+            <w:tcMar>
+              <w:top w:w="120" w:type="dxa"/>
+              <w:left w:w="180" w:type="dxa"/>
+              <w:bottom w:w="120" w:type="dxa"/>
+              <w:right w:w="180" w:type="dxa"/>
+            </w:tcMar>
+            <w:vAlign w:val="center"/>
+            <w:hideMark/>
+          </w:tcPr>
+          <w:p>
+            <w:pPr>
+              <w:spacing w:after="480" w:line="240" w:lineRule="auto"/>
+              <w:rPr>
+                <w:rFonts w:ascii="Times New Roman" w:eastAsia="Times New Roman" w:hAnsi="Times New Roman" w:cs="Times New Roman"/>
+                <w:sz w:val="24"/>
+                <w:szCs w:val="24"/>
+              </w:rPr>
+            </w:pPr>
+            <w:r>
+              <w:rPr>
+                <w:rFonts w:ascii="Times New Roman" w:eastAsia="Times New Roman" w:hAnsi="Times New Roman" w:cs="Times New Roman"/>
+                <w:b/>
+                <w:bCs/>
+                <w:sz w:val="24"/>
+                <w:szCs w:val="24"/>
+              </w:rPr>
+              <w:t>Field Name</w:t>
+            </w:r>
+          </w:p>
+        </w:tc>
+        <w:tc>
+          <w:tcPr>
+            <w:tcW w:w="0" w:type="auto"/>
+            <w:tcBorders>
+              <w:top w:val="single" w:sz="6" w:space="0" w:color="C4C7C5"/>
+              <w:left w:val="single" w:sz="6" w:space="0" w:color="C4C7C5"/>
+              <w:bottom w:val="single" w:sz="6" w:space="0" w:color="C4C7C5"/>
+              <w:right w:val="single" w:sz="6" w:space="0" w:color="C4C7C5"/>
+            </w:tcBorders>
+            <w:tcMar>
+              <w:top w:w="120" w:type="dxa"/>
+              <w:left w:w="180" w:type="dxa"/>
+              <w:bottom w:w="120" w:type="dxa"/>
+              <w:right w:w="180" w:type="dxa"/>
+            </w:tcMar>
+            <w:vAlign w:val="center"/>
+            <w:hideMark/>
+          </w:tcPr>
+          <w:p>
+            <w:pPr>
+              <w:spacing w:after="480" w:line="240" w:lineRule="auto"/>
+              <w:rPr>
+                <w:rFonts w:ascii="Times New Roman" w:eastAsia="Times New Roman" w:hAnsi="Times New Roman" w:cs="Times New Roman"/>
+                <w:sz w:val="24"/>
+                <w:szCs w:val="24"/>
+              </w:rPr>
+            </w:pPr>
+            <w:r>
+              <w:rPr>
+                <w:rFonts w:ascii="Times New Roman" w:eastAsia="Times New Roman" w:hAnsi="Times New Roman" w:cs="Times New Roman"/>
+                <w:b/>
+                <w:bCs/>
+                <w:sz w:val="24"/>
+                <w:szCs w:val="24"/>
+              </w:rPr>
+              <w:t>Entry 1 (Settled)</w:t>
+            </w:r>
+          </w:p>
+        </w:tc>
+        <w:tc>
+          <w:tcPr>
+            <w:tcW w:w="0" w:type="auto"/>
+            <w:tcBorders>
+              <w:top w:val="single" w:sz="6" w:space="0" w:color="C4C7C5"/>
+              <w:left w:val="single" w:sz="6" w:space="0" w:color="C4C7C5"/>
+              <w:bottom w:val="single" w:sz="6" w:space="0" w:color="C4C7C5"/>
+              <w:right w:val="single" w:sz="6" w:space="0" w:color="C4C7C5"/>
+            </w:tcBorders>
+            <w:tcMar>
+              <w:top w:w="120" w:type="dxa"/>
+              <w:left w:w="180" w:type="dxa"/>
+              <w:bottom w:w="120" w:type="dxa"/>
+              <w:right w:w="180" w:type="dxa"/>
+            </w:tcMar>
+            <w:vAlign w:val="center"/>
+            <w:hideMark/>
+          </w:tcPr>
+          <w:p>
+            <w:pPr>
+              <w:spacing w:after="480" w:line="240" w:lineRule="auto"/>
+              <w:rPr>
+                <w:rFonts w:ascii="Times New Roman" w:eastAsia="Times New Roman" w:hAnsi="Times New Roman" w:cs="Times New Roman"/>
+                <w:sz w:val="24"/>
+                <w:szCs w:val="24"/>
+              </w:rPr>
+            </w:pPr>
+            <w:r>
+              <w:rPr>
+                <w:rFonts w:ascii="Times New Roman" w:eastAsia="Times New Roman" w:hAnsi="Times New Roman" w:cs="Times New Roman"/>
+                <w:b/>
+                <w:bCs/>
+                <w:sz w:val="24"/>
+                <w:szCs w:val="24"/>
+              </w:rPr>
+              <w:t>Entry 2 (Partially Paid)</w:t>
+            </w:r>
+          </w:p>
+        </w:tc>
+        <w:tc>
+          <w:tcPr>
+            <w:tcW w:w="0" w:type="auto"/>
+            <w:tcBorders>
+              <w:top w:val="single" w:sz="6" w:space="0" w:color="C4C7C5"/>
+              <w:left w:val="single" w:sz="6" w:space="0" w:color="C4C7C5"/>
+              <w:bottom w:val="single" w:sz="6" w:space="0" w:color="C4C7C5"/>
+              <w:right w:val="single" w:sz="6" w:space="0" w:color="C4C7C5"/>
+            </w:tcBorders>
+            <w:tcMar>
+              <w:top w:w="120" w:type="dxa"/>
+              <w:left w:w="180" w:type="dxa"/>
+              <w:bottom w:w="120" w:type="dxa"/>
+              <w:right w:w="180" w:type="dxa"/>
+            </w:tcMar>
+            <w:vAlign w:val="center"/>
+            <w:hideMark/>
+          </w:tcPr>
+          <w:p>
+            <w:pPr>
+              <w:spacing w:after="480" w:line="240" w:lineRule="auto"/>
+              <w:rPr>
+                <w:rFonts w:ascii="Times New Roman" w:eastAsia="Times New Roman" w:hAnsi="Times New Roman" w:cs="Times New Roman"/>
+                <w:sz w:val="24"/>
+                <w:szCs w:val="24"/>
+              </w:rPr>
+            </w:pPr>
+            <w:r>
+              <w:rPr>
+                <w:rFonts w:ascii="Times New Roman" w:eastAsia="Times New Roman" w:hAnsi="Times New Roman" w:cs="Times New Roman"/>
+                <w:b/>
+                <w:bCs/>
+                <w:sz w:val="24"/>
+                <w:szCs w:val="24"/>
+              </w:rPr>
+              <w:t>Entry 3 (High Value Due)</w:t>
+            </w:r>
+          </w:p>
+        </w:tc>
+      </w:tr>
+      <w:tr>
+        <w:trPr>
+          <w:tblCellSpacing w:w="15" w:type="dxa"/>
+        </w:trPr>
+        <w:tc>
+          <w:tcPr>
+            <w:tcW w:w="0" w:type="auto"/>
+            <w:tcBorders>
+              <w:top w:val="single" w:sz="6" w:space="0" w:color="C4C7C5"/>
+              <w:left w:val="single" w:sz="6" w:space="0" w:color="C4C7C5"/>
+              <w:bottom w:val="single" w:sz="6" w:space="0" w:color="C4C7C5"/>
+              <w:right w:val="single" w:sz="6" w:space="0" w:color="C4C7C5"/>
+            </w:tcBorders>
+            <w:tcMar>
+              <w:top w:w="120" w:type="dxa"/>
+              <w:left w:w="180" w:type="dxa"/>
+              <w:bottom w:w="120" w:type="dxa"/>
+              <w:right w:w="180" w:type="dxa"/>
+            </w:tcMar>
+            <w:vAlign w:val="center"/>
+            <w:hideMark/>
+          </w:tcPr>
+          <w:p>
+            <w:pPr>
+              <w:spacing w:after="480" w:line="240" w:lineRule="auto"/>
+              <w:rPr>
+                <w:rFonts w:ascii="Times New Roman" w:eastAsia="Times New Roman" w:hAnsi="Times New Roman" w:cs="Times New Roman"/>
+                <w:sz w:val="24"/>
+                <w:szCs w:val="24"/>
+              </w:rPr>
+            </w:pPr>
+            <w:r>
+              <w:rPr>
+                <w:rFonts w:ascii="Times New Roman" w:eastAsia="Times New Roman" w:hAnsi="Times New Roman" w:cs="Times New Roman"/>
+                <w:b/>
+                <w:bCs/>
+                <w:sz w:val="24"/>
+                <w:szCs w:val="24"/>
+              </w:rPr>
+              <w:t>Responsible Staff Name</w:t>
+            </w:r>
+          </w:p>
+        </w:tc>
+        <w:tc>
+          <w:tcPr>
+            <w:tcW w:w="0" w:type="auto"/>
+            <w:tcBorders>
+              <w:top w:val="single" w:sz="6" w:space="0" w:color="C4C7C5"/>
+              <w:left w:val="single" w:sz="6" w:space="0" w:color="C4C7C5"/>
+              <w:bottom w:val="single" w:sz="6" w:space="0" w:color="C4C7C5"/>
+              <w:right w:val="single" w:sz="6" w:space="0" w:color="C4C7C5"/>
+            </w:tcBorders>
+            <w:tcMar>
+              <w:top w:w="120" w:type="dxa"/>
+              <w:left w:w="180" w:type="dxa"/>
+              <w:bottom w:w="120" w:type="dxa"/>
+              <w:right w:w="180" w:type="dxa"/>
+            </w:tcMar>
+            <w:vAlign w:val="center"/>
+            <w:hideMark/>
+          </w:tcPr>
+          <w:p>
+            <w:pPr>
+              <w:spacing w:after="480" w:line="240" w:lineRule="auto"/>
+              <w:rPr>
+                <w:rFonts w:ascii="Times New Roman" w:eastAsia="Times New Roman" w:hAnsi="Times New Roman" w:cs="Times New Roman"/>
+                <w:sz w:val="24"/>
+                <w:szCs w:val="24"/>
+              </w:rPr>
+            </w:pPr>
+            <w:proofErr w:type="spellStart"/>
+            <w:r>
+              <w:rPr>
+                <w:rFonts w:ascii="Courier New" w:eastAsia="Times New Roman" w:hAnsi="Courier New" w:cs="Courier New"/>
+                <w:sz w:val="20"/>
+              </w:rPr>
+              <w:t>Rahul</w:t>
+            </w:r>
+            <w:proofErr w:type="spellEnd"/>
+            <w:r>
+              <w:rPr>
+                <w:rFonts w:ascii="Courier New" w:eastAsia="Times New Roman" w:hAnsi="Courier New" w:cs="Courier New"/>
+                <w:sz w:val="20"/>
+              </w:rPr>
+              <w:t xml:space="preserve"> Sharma</w:t>
+            </w:r>
+          </w:p>
+        </w:tc>
+        <w:tc>
+          <w:tcPr>
+            <w:tcW w:w="0" w:type="auto"/>
+            <w:tcBorders>
+              <w:top w:val="single" w:sz="6" w:space="0" w:color="C4C7C5"/>
+              <w:left w:val="single" w:sz="6" w:space="0" w:color="C4C7C5"/>
+              <w:bottom w:val="single" w:sz="6" w:space="0" w:color="C4C7C5"/>
+              <w:right w:val="single" w:sz="6" w:space="0" w:color="C4C7C5"/>
+            </w:tcBorders>
+            <w:tcMar>
+              <w:top w:w="120" w:type="dxa"/>
+              <w:left w:w="180" w:type="dxa"/>
+              <w:bottom w:w="120" w:type="dxa"/>
+              <w:right w:w="180" w:type="dxa"/>
+            </w:tcMar>
+            <w:vAlign w:val="center"/>
+            <w:hideMark/>
+          </w:tcPr>
+          <w:p>
+            <w:pPr>
+              <w:spacing w:after="480" w:line="240" w:lineRule="auto"/>
+              <w:rPr>
+                <w:rFonts w:ascii="Times New Roman" w:eastAsia="Times New Roman" w:hAnsi="Times New Roman" w:cs="Times New Roman"/>
+                <w:sz w:val="24"/>
+                <w:szCs w:val="24"/>
+              </w:rPr>
+            </w:pPr>
+            <w:proofErr w:type="spellStart"/>
+            <w:r>
+              <w:rPr>
+                <w:rFonts w:ascii="Courier New" w:eastAsia="Times New Roman" w:hAnsi="Courier New" w:cs="Courier New"/>
+                <w:sz w:val="20"/>
+              </w:rPr>
+              <w:t>Amit</w:t>
+            </w:r>
+            <w:proofErr w:type="spellEnd"/>
+            <w:r>
+              <w:rPr>
+                <w:rFonts w:ascii="Courier New" w:eastAsia="Times New Roman" w:hAnsi="Courier New" w:cs="Courier New"/>
+                <w:sz w:val="20"/>
+              </w:rPr>
+              <w:t xml:space="preserve"> Das</w:t>
+            </w:r>
+          </w:p>
+        </w:tc>
+        <w:tc>
+          <w:tcPr>
+            <w:tcW w:w="0" w:type="auto"/>
+            <w:tcBorders>
+              <w:top w:val="single" w:sz="6" w:space="0" w:color="C4C7C5"/>
+              <w:left w:val="single" w:sz="6" w:space="0" w:color="C4C7C5"/>
+              <w:bottom w:val="single" w:sz="6" w:space="0" w:color="C4C7C5"/>
+              <w:right w:val="single" w:sz="6" w:space="0" w:color="C4C7C5"/>
+            </w:tcBorders>
+            <w:tcMar>
+              <w:top w:w="120" w:type="dxa"/>
+              <w:left w:w="180" w:type="dxa"/>
+              <w:bottom w:w="120" w:type="dxa"/>
+              <w:right w:w="180" w:type="dxa"/>
+            </w:tcMar>
+            <w:vAlign w:val="center"/>
+            <w:hideMark/>
+          </w:tcPr>
+          <w:p>
+            <w:pPr>
+              <w:spacing w:after="480" w:line="240" w:lineRule="auto"/>
+              <w:rPr>
+                <w:rFonts w:ascii="Times New Roman" w:eastAsia="Times New Roman" w:hAnsi="Times New Roman" w:cs="Times New Roman"/>
+                <w:sz w:val="24"/>
+                <w:szCs w:val="24"/>
+              </w:rPr>
+            </w:pPr>
+            <w:proofErr w:type="spellStart"/>
+            <w:r>
+              <w:rPr>
+                <w:rFonts w:ascii="Courier New" w:eastAsia="Times New Roman" w:hAnsi="Courier New" w:cs="Courier New"/>
+                <w:sz w:val="20"/>
+              </w:rPr>
+              <w:t>Vikram</w:t>
+            </w:r>
+            <w:proofErr w:type="spellEnd"/>
+            <w:r>
+              <w:rPr>
+                <w:rFonts w:ascii="Courier New" w:eastAsia="Times New Roman" w:hAnsi="Courier New" w:cs="Courier New"/>
+                <w:sz w:val="20"/>
+              </w:rPr>
+              <w:t xml:space="preserve"> Singh</w:t>
+            </w:r>
+          </w:p>
+        </w:tc>
+      </w:tr>
+      <w:tr>
+        <w:trPr>
+          <w:tblCellSpacing w:w="15" w:type="dxa"/>
+        </w:trPr>
+        <w:tc>
+          <w:tcPr>
+            <w:tcW w:w="0" w:type="auto"/>
+            <w:tcBorders>
+              <w:top w:val="single" w:sz="6" w:space="0" w:color="C4C7C5"/>
+              <w:left w:val="single" w:sz="6" w:space="0" w:color="C4C7C5"/>
+              <w:bottom w:val="single" w:sz="6" w:space="0" w:color="C4C7C5"/>
+              <w:right w:val="single" w:sz="6" w:space="0" w:color="C4C7C5"/>
+            </w:tcBorders>
+            <w:tcMar>
+              <w:top w:w="120" w:type="dxa"/>
+              <w:left w:w="180" w:type="dxa"/>
+              <w:bottom w:w="120" w:type="dxa"/>
+              <w:right w:w="180" w:type="dxa"/>
+            </w:tcMar>
+            <w:vAlign w:val="center"/>
+            <w:hideMark/>
+          </w:tcPr>
+          <w:p>
+            <w:pPr>
+              <w:spacing w:after="480" w:line="240" w:lineRule="auto"/>
+              <w:rPr>
+                <w:rFonts w:ascii="Times New Roman" w:eastAsia="Times New Roman" w:hAnsi="Times New Roman" w:cs="Times New Roman"/>
+                <w:sz w:val="24"/>
+                <w:szCs w:val="24"/>
+              </w:rPr>
+            </w:pPr>
+            <w:r>
+              <w:rPr>
+                <w:rFonts w:ascii="Times New Roman" w:eastAsia="Times New Roman" w:hAnsi="Times New Roman" w:cs="Times New Roman"/>
+                <w:b/>
+                <w:bCs/>
+                <w:sz w:val="24"/>
+                <w:szCs w:val="24"/>
+              </w:rPr>
+              <w:t>Invoice No</w:t>
+            </w:r>
+          </w:p>
+        </w:tc>
+        <w:tc>
+          <w:tcPr>
+            <w:tcW w:w="0" w:type="auto"/>
+            <w:tcBorders>
+              <w:top w:val="single" w:sz="6" w:space="0" w:color="C4C7C5"/>
+              <w:left w:val="single" w:sz="6" w:space="0" w:color="C4C7C5"/>
+              <w:bottom w:val="single" w:sz="6" w:space="0" w:color="C4C7C5"/>
+              <w:right w:val="single" w:sz="6" w:space="0" w:color="C4C7C5"/>
+            </w:tcBorders>
+            <w:tcMar>
+              <w:top w:w="120" w:type="dxa"/>
+              <w:left w:w="180" w:type="dxa"/>
+              <w:bottom w:w="120" w:type="dxa"/>
+              <w:right w:w="180" w:type="dxa"/>
+            </w:tcMar>
+            <w:vAlign w:val="center"/>
+            <w:hideMark/>
+          </w:tcPr>
+          <w:p>
+            <w:pPr>
+              <w:spacing w:after="480" w:line="240" w:lineRule="auto"/>
+              <w:rPr>
+                <w:rFonts w:ascii="Times New Roman" w:eastAsia="Times New Roman" w:hAnsi="Times New Roman" w:cs="Times New Roman"/>
+                <w:sz w:val="24"/>
+                <w:szCs w:val="24"/>
+              </w:rPr>
+            </w:pPr>
+            <w:r>
+              <w:rPr>
+                <w:rFonts w:ascii="Courier New" w:eastAsia="Times New Roman" w:hAnsi="Courier New" w:cs="Courier New"/>
+                <w:sz w:val="20"/>
+              </w:rPr>
+              <w:t>INV-2026-081</w:t>
+            </w:r>
+          </w:p>
+        </w:tc>
+        <w:tc>
+          <w:tcPr>
+            <w:tcW w:w="0" w:type="auto"/>
+            <w:tcBorders>
+              <w:top w:val="single" w:sz="6" w:space="0" w:color="C4C7C5"/>
+              <w:left w:val="single" w:sz="6" w:space="0" w:color="C4C7C5"/>
+              <w:bottom w:val="single" w:sz="6" w:space="0" w:color="C4C7C5"/>
+              <w:right w:val="single" w:sz="6" w:space="0" w:color="C4C7C5"/>
+            </w:tcBorders>
+            <w:tcMar>
+              <w:top w:w="120" w:type="dxa"/>
+              <w:left w:w="180" w:type="dxa"/>
+              <w:bottom w:w="120" w:type="dxa"/>
+              <w:right w:w="180" w:type="dxa"/>
+            </w:tcMar>
+            <w:vAlign w:val="center"/>
+            <w:hideMark/>
+          </w:tcPr>
+          <w:p>
+            <w:pPr>
+              <w:spacing w:after="480" w:line="240" w:lineRule="auto"/>
+              <w:rPr>
+                <w:rFonts w:ascii="Times New Roman" w:eastAsia="Times New Roman" w:hAnsi="Times New Roman" w:cs="Times New Roman"/>
+                <w:sz w:val="24"/>
+                <w:szCs w:val="24"/>
+              </w:rPr>
+            </w:pPr>
+            <w:r>
+              <w:rPr>
+                <w:rFonts w:ascii="Courier New" w:eastAsia="Times New Roman" w:hAnsi="Courier New" w:cs="Courier New"/>
+                <w:sz w:val="20"/>
+              </w:rPr>
+              <w:t>INV-2026-094</w:t>
+            </w:r>
+          </w:p>
+        </w:tc>
+        <w:tc>
+          <w:tcPr>
+            <w:tcW w:w="0" w:type="auto"/>
+            <w:tcBorders>
+              <w:top w:val="single" w:sz="6" w:space="0" w:color="C4C7C5"/>
+              <w:left w:val="single" w:sz="6" w:space="0" w:color="C4C7C5"/>
+              <w:bottom w:val="single" w:sz="6" w:space="0" w:color="C4C7C5"/>
+              <w:right w:val="single" w:sz="6" w:space="0" w:color="C4C7C5"/>
+            </w:tcBorders>
+            <w:tcMar>
+              <w:top w:w="120" w:type="dxa"/>
+              <w:left w:w="180" w:type="dxa"/>
+              <w:bottom w:w="120" w:type="dxa"/>
+              <w:right w:w="180" w:type="dxa"/>
+            </w:tcMar>
+            <w:vAlign w:val="center"/>
+            <w:hideMark/>
+          </w:tcPr>
+          <w:p>
+            <w:pPr>
+              <w:spacing w:after="480" w:line="240" w:lineRule="auto"/>
+              <w:rPr>
+                <w:rFonts w:ascii="Times New Roman" w:eastAsia="Times New Roman" w:hAnsi="Times New Roman" w:cs="Times New Roman"/>
+                <w:sz w:val="24"/>
+                <w:szCs w:val="24"/>
+              </w:rPr>
+            </w:pPr>
+            <w:r>
+              <w:rPr>
+                <w:rFonts w:ascii="Courier New" w:eastAsia="Times New Roman" w:hAnsi="Courier New" w:cs="Courier New"/>
+                <w:sz w:val="20"/>
+              </w:rPr>
+              <w:t>INV-2026-102</w:t>
+            </w:r>
+          </w:p>
+        </w:tc>
+      </w:tr>
+      <w:tr>
+        <w:trPr>
+          <w:tblCellSpacing w:w="15" w:type="dxa"/>
+        </w:trPr>
+        <w:tc>
+          <w:tcPr>
+            <w:tcW w:w="0" w:type="auto"/>
+            <w:tcBorders>
+              <w:top w:val="single" w:sz="6" w:space="0" w:color="C4C7C5"/>
+              <w:left w:val="single" w:sz="6" w:space="0" w:color="C4C7C5"/>
+              <w:bottom w:val="single" w:sz="6" w:space="0" w:color="C4C7C5"/>
+              <w:right w:val="single" w:sz="6" w:space="0" w:color="C4C7C5"/>
+            </w:tcBorders>
+            <w:tcMar>
+              <w:top w:w="120" w:type="dxa"/>
+              <w:left w:w="180" w:type="dxa"/>
+              <w:bottom w:w="120" w:type="dxa"/>
+              <w:right w:w="180" w:type="dxa"/>
+            </w:tcMar>
+            <w:vAlign w:val="center"/>
+            <w:hideMark/>
+          </w:tcPr>
+          <w:p>
+            <w:pPr>
+              <w:spacing w:after="480" w:line="240" w:lineRule="auto"/>
+              <w:rPr>
+                <w:rFonts w:ascii="Times New Roman" w:eastAsia="Times New Roman" w:hAnsi="Times New Roman" w:cs="Times New Roman"/>
+                <w:sz w:val="24"/>
+                <w:szCs w:val="24"/>
+              </w:rPr>
+            </w:pPr>
+            <w:r>
+              <w:rPr>
+                <w:rFonts w:ascii="Times New Roman" w:eastAsia="Times New Roman" w:hAnsi="Times New Roman" w:cs="Times New Roman"/>
+                <w:b/>
+                <w:bCs/>
+                <w:sz w:val="24"/>
+                <w:szCs w:val="24"/>
+              </w:rPr>
+              <w:t xml:space="preserve">Laundry Vendor </w:t>
+            </w:r>
+            <w:r>
+              <w:rPr>
+                <w:rFonts w:ascii="Times New Roman" w:eastAsia="Times New Roman" w:hAnsi="Times New Roman" w:cs="Times New Roman"/>
+                <w:b/>
+                <w:bCs/>
+                <w:sz w:val="24"/>
+                <w:szCs w:val="24"/>
+              </w:rPr>
+              <w:lastRenderedPageBreak/>
+              <w:t>Name</w:t>
+            </w:r>
+          </w:p>
+        </w:tc>
+        <w:tc>
+          <w:tcPr>
+            <w:tcW w:w="0" w:type="auto"/>
+            <w:tcBorders>
+              <w:top w:val="single" w:sz="6" w:space="0" w:color="C4C7C5"/>
+              <w:left w:val="single" w:sz="6" w:space="0" w:color="C4C7C5"/>
+              <w:bottom w:val="single" w:sz="6" w:space="0" w:color="C4C7C5"/>
+              <w:right w:val="single" w:sz="6" w:space="0" w:color="C4C7C5"/>
+            </w:tcBorders>
+            <w:tcMar>
+              <w:top w:w="120" w:type="dxa"/>
+              <w:left w:w="180" w:type="dxa"/>
+              <w:bottom w:w="120" w:type="dxa"/>
+              <w:right w:w="180" w:type="dxa"/>
+            </w:tcMar>
+            <w:vAlign w:val="center"/>
+            <w:hideMark/>
+          </w:tcPr>
+          <w:p>
+            <w:pPr>
+              <w:spacing w:after="480" w:line="240" w:lineRule="auto"/>
+              <w:rPr>
+                <w:rFonts w:ascii="Times New Roman" w:eastAsia="Times New Roman" w:hAnsi="Times New Roman" w:cs="Times New Roman"/>
+                <w:sz w:val="24"/>
+                <w:szCs w:val="24"/>
+              </w:rPr>
+            </w:pPr>
+            <w:r>
+              <w:rPr>
+                <w:rFonts w:ascii="Courier New" w:eastAsia="Times New Roman" w:hAnsi="Courier New" w:cs="Courier New"/>
+                <w:sz w:val="20"/>
+              </w:rPr>
+              <w:lastRenderedPageBreak/>
+              <w:t xml:space="preserve">Apex Luxury </w:t>
+            </w:r>
+            <w:r>
+              <w:rPr>
+                <w:rFonts w:ascii="Courier New" w:eastAsia="Times New Roman" w:hAnsi="Courier New" w:cs="Courier New"/>
+                <w:sz w:val="20"/>
+              </w:rPr>
+              <w:lastRenderedPageBreak/>
+              <w:t>Cleaners</w:t>
+            </w:r>
+          </w:p>
+        </w:tc>
+        <w:tc>
+          <w:tcPr>
+            <w:tcW w:w="0" w:type="auto"/>
+            <w:tcBorders>
+              <w:top w:val="single" w:sz="6" w:space="0" w:color="C4C7C5"/>
+              <w:left w:val="single" w:sz="6" w:space="0" w:color="C4C7C5"/>
+              <w:bottom w:val="single" w:sz="6" w:space="0" w:color="C4C7C5"/>
+              <w:right w:val="single" w:sz="6" w:space="0" w:color="C4C7C5"/>
+            </w:tcBorders>
+            <w:tcMar>
+              <w:top w:w="120" w:type="dxa"/>
+              <w:left w:w="180" w:type="dxa"/>
+              <w:bottom w:w="120" w:type="dxa"/>
+              <w:right w:w="180" w:type="dxa"/>
+            </w:tcMar>
+            <w:vAlign w:val="center"/>
+            <w:hideMark/>
+          </w:tcPr>
+          <w:p>
+            <w:pPr>
+              <w:spacing w:after="480" w:line="240" w:lineRule="auto"/>
+              <w:rPr>
+                <w:rFonts w:ascii="Times New Roman" w:eastAsia="Times New Roman" w:hAnsi="Times New Roman" w:cs="Times New Roman"/>
+                <w:sz w:val="24"/>
+                <w:szCs w:val="24"/>
+              </w:rPr>
+            </w:pPr>
+            <w:r>
+              <w:rPr>
+                <w:rFonts w:ascii="Courier New" w:eastAsia="Times New Roman" w:hAnsi="Courier New" w:cs="Courier New"/>
+                <w:sz w:val="20"/>
+              </w:rPr>
+              <w:lastRenderedPageBreak/>
+              <w:t xml:space="preserve">White Glove </w:t>
+            </w:r>
+            <w:r>
+              <w:rPr>
+                <w:rFonts w:ascii="Courier New" w:eastAsia="Times New Roman" w:hAnsi="Courier New" w:cs="Courier New"/>
+                <w:sz w:val="20"/>
+              </w:rPr>
+              <w:lastRenderedPageBreak/>
+              <w:t>Linens</w:t>
+            </w:r>
+          </w:p>
+        </w:tc>
+        <w:tc>
+          <w:tcPr>
+            <w:tcW w:w="0" w:type="auto"/>
+            <w:tcBorders>
+              <w:top w:val="single" w:sz="6" w:space="0" w:color="C4C7C5"/>
+              <w:left w:val="single" w:sz="6" w:space="0" w:color="C4C7C5"/>
+              <w:bottom w:val="single" w:sz="6" w:space="0" w:color="C4C7C5"/>
+              <w:right w:val="single" w:sz="6" w:space="0" w:color="C4C7C5"/>
+            </w:tcBorders>
+            <w:tcMar>
+              <w:top w:w="120" w:type="dxa"/>
+              <w:left w:w="180" w:type="dxa"/>
+              <w:bottom w:w="120" w:type="dxa"/>
+              <w:right w:w="180" w:type="dxa"/>
+            </w:tcMar>
+            <w:vAlign w:val="center"/>
+            <w:hideMark/>
+          </w:tcPr>
+          <w:p>
+            <w:pPr>
+              <w:spacing w:after="480" w:line="240" w:lineRule="auto"/>
+              <w:rPr>
+                <w:rFonts w:ascii="Times New Roman" w:eastAsia="Times New Roman" w:hAnsi="Times New Roman" w:cs="Times New Roman"/>
+                <w:sz w:val="24"/>
+                <w:szCs w:val="24"/>
+              </w:rPr>
+            </w:pPr>
+            <w:r>
+              <w:rPr>
+                <w:rFonts w:ascii="Courier New" w:eastAsia="Times New Roman" w:hAnsi="Courier New" w:cs="Courier New"/>
+                <w:sz w:val="20"/>
+              </w:rPr>
+              <w:lastRenderedPageBreak/>
+              <w:t xml:space="preserve">Metro Commercial </w:t>
+            </w:r>
+            <w:r>
+              <w:rPr>
+                <w:rFonts w:ascii="Courier New" w:eastAsia="Times New Roman" w:hAnsi="Courier New" w:cs="Courier New"/>
+                <w:sz w:val="20"/>
+              </w:rPr>
+              <w:lastRenderedPageBreak/>
+              <w:t>Laundry</w:t>
+            </w:r>
+          </w:p>
+        </w:tc>
+      </w:tr>
+      <w:tr>
+        <w:trPr>
+          <w:tblCellSpacing w:w="15" w:type="dxa"/>
+        </w:trPr>
+        <w:tc>
+          <w:tcPr>
+            <w:tcW w:w="0" w:type="auto"/>
+            <w:tcBorders>
+              <w:top w:val="single" w:sz="6" w:space="0" w:color="C4C7C5"/>
+              <w:left w:val="single" w:sz="6" w:space="0" w:color="C4C7C5"/>
+              <w:bottom w:val="single" w:sz="6" w:space="0" w:color="C4C7C5"/>
+              <w:right w:val="single" w:sz="6" w:space="0" w:color="C4C7C5"/>
+            </w:tcBorders>
+            <w:tcMar>
+              <w:top w:w="120" w:type="dxa"/>
+              <w:left w:w="180" w:type="dxa"/>
+              <w:bottom w:w="120" w:type="dxa"/>
+              <w:right w:w="180" w:type="dxa"/>
+            </w:tcMar>
+            <w:vAlign w:val="center"/>
+            <w:hideMark/>
+          </w:tcPr>
+          <w:p>
+            <w:pPr>
+              <w:spacing w:after="480" w:line="240" w:lineRule="auto"/>
+              <w:rPr>
+                <w:rFonts w:ascii="Times New Roman" w:eastAsia="Times New Roman" w:hAnsi="Times New Roman" w:cs="Times New Roman"/>
+                <w:sz w:val="24"/>
+                <w:szCs w:val="24"/>
+              </w:rPr>
+            </w:pPr>
+            <w:r>
+              <w:rPr>
+                <w:rFonts w:ascii="Times New Roman" w:eastAsia="Times New Roman" w:hAnsi="Times New Roman" w:cs="Times New Roman"/>
+                <w:b/>
+                <w:bCs/>
+                <w:sz w:val="24"/>
+                <w:szCs w:val="24"/>
+              </w:rPr>
+              <w:lastRenderedPageBreak/>
+              <w:t>Total Bill Amount (₹)</w:t>
+            </w:r>
+          </w:p>
+        </w:tc>
+        <w:tc>
+          <w:tcPr>
+            <w:tcW w:w="0" w:type="auto"/>
+            <w:tcBorders>
+              <w:top w:val="single" w:sz="6" w:space="0" w:color="C4C7C5"/>
+              <w:left w:val="single" w:sz="6" w:space="0" w:color="C4C7C5"/>
+              <w:bottom w:val="single" w:sz="6" w:space="0" w:color="C4C7C5"/>
+              <w:right w:val="single" w:sz="6" w:space="0" w:color="C4C7C5"/>
+            </w:tcBorders>
+            <w:tcMar>
+              <w:top w:w="120" w:type="dxa"/>
+              <w:left w:w="180" w:type="dxa"/>
+              <w:bottom w:w="120" w:type="dxa"/>
+              <w:right w:w="180" w:type="dxa"/>
+            </w:tcMar>
+            <w:vAlign w:val="center"/>
+            <w:hideMark/>
+          </w:tcPr>
+          <w:p>
+            <w:pPr>
+              <w:spacing w:after="480" w:line="240" w:lineRule="auto"/>
+              <w:rPr>
+                <w:rFonts w:ascii="Times New Roman" w:eastAsia="Times New Roman" w:hAnsi="Times New Roman" w:cs="Times New Roman"/>
+                <w:sz w:val="24"/>
+                <w:szCs w:val="24"/>
+              </w:rPr>
+            </w:pPr>
+            <w:r>
+              <w:rPr>
+                <w:rFonts w:ascii="Courier New" w:eastAsia="Times New Roman" w:hAnsi="Courier New" w:cs="Courier New"/>
+                <w:sz w:val="20"/>
+              </w:rPr>
+              <w:t>4500</w:t>
+            </w:r>
+          </w:p>
+        </w:tc>
+        <w:tc>
+          <w:tcPr>
+            <w:tcW w:w="0" w:type="auto"/>
+            <w:tcBorders>
+              <w:top w:val="single" w:sz="6" w:space="0" w:color="C4C7C5"/>
+              <w:left w:val="single" w:sz="6" w:space="0" w:color="C4C7C5"/>
+              <w:bottom w:val="single" w:sz="6" w:space="0" w:color="C4C7C5"/>
+              <w:right w:val="single" w:sz="6" w:space="0" w:color="C4C7C5"/>
+            </w:tcBorders>
+            <w:tcMar>
+              <w:top w:w="120" w:type="dxa"/>
+              <w:left w:w="180" w:type="dxa"/>
+              <w:bottom w:w="120" w:type="dxa"/>
+              <w:right w:w="180" w:type="dxa"/>
+            </w:tcMar>
+            <w:vAlign w:val="center"/>
+            <w:hideMark/>
+          </w:tcPr>
+          <w:p>
+            <w:pPr>
+              <w:spacing w:after="480" w:line="240" w:lineRule="auto"/>
+              <w:rPr>
+                <w:rFonts w:ascii="Times New Roman" w:eastAsia="Times New Roman" w:hAnsi="Times New Roman" w:cs="Times New Roman"/>
+                <w:sz w:val="24"/>
+                <w:szCs w:val="24"/>
+              </w:rPr>
+            </w:pPr>
+            <w:r>
+              <w:rPr>
+                <w:rFonts w:ascii="Courier New" w:eastAsia="Times New Roman" w:hAnsi="Courier New" w:cs="Courier New"/>
+                <w:sz w:val="20"/>
+              </w:rPr>
+              <w:t>8200</w:t>
+            </w:r>
+          </w:p>
+        </w:tc>
+        <w:tc>
+          <w:tcPr>
+            <w:tcW w:w="0" w:type="auto"/>
+            <w:tcBorders>
+              <w:top w:val="single" w:sz="6" w:space="0" w:color="C4C7C5"/>
+              <w:left w:val="single" w:sz="6" w:space="0" w:color="C4C7C5"/>
+              <w:bottom w:val="single" w:sz="6" w:space="0" w:color="C4C7C5"/>
+              <w:right w:val="single" w:sz="6" w:space="0" w:color="C4C7C5"/>
+            </w:tcBorders>
+            <w:tcMar>
+              <w:top w:w="120" w:type="dxa"/>
+              <w:left w:w="180" w:type="dxa"/>
+              <w:bottom w:w="120" w:type="dxa"/>
+              <w:right w:w="180" w:type="dxa"/>
+            </w:tcMar>
+            <w:vAlign w:val="center"/>
+            <w:hideMark/>
+          </w:tcPr>
+          <w:p>
+            <w:pPr>
+              <w:spacing w:after="480" w:line="240" w:lineRule="auto"/>
+              <w:rPr>
+                <w:rFonts w:ascii="Times New Roman" w:eastAsia="Times New Roman" w:hAnsi="Times New Roman" w:cs="Times New Roman"/>
+                <w:sz w:val="24"/>
+                <w:szCs w:val="24"/>
+              </w:rPr>
+            </w:pPr>
+            <w:r>
+              <w:rPr>
+                <w:rFonts w:ascii="Courier New" w:eastAsia="Times New Roman" w:hAnsi="Courier New" w:cs="Courier New"/>
+                <w:sz w:val="20"/>
+              </w:rPr>
+              <w:t>15000</w:t>
+            </w:r>
+          </w:p>
+        </w:tc>
+      </w:tr>
+      <w:tr>
+        <w:trPr>
+          <w:tblCellSpacing w:w="15" w:type="dxa"/>
+        </w:trPr>
+        <w:tc>
+          <w:tcPr>
+            <w:tcW w:w="0" w:type="auto"/>
+            <w:tcBorders>
+              <w:top w:val="single" w:sz="6" w:space="0" w:color="C4C7C5"/>
+              <w:left w:val="single" w:sz="6" w:space="0" w:color="C4C7C5"/>
+              <w:bottom w:val="single" w:sz="6" w:space="0" w:color="C4C7C5"/>
+              <w:right w:val="single" w:sz="6" w:space="0" w:color="C4C7C5"/>
+            </w:tcBorders>
+            <w:tcMar>
+              <w:top w:w="120" w:type="dxa"/>
+              <w:left w:w="180" w:type="dxa"/>
+              <w:bottom w:w="120" w:type="dxa"/>
+              <w:right w:w="180" w:type="dxa"/>
+            </w:tcMar>
+            <w:vAlign w:val="center"/>
+            <w:hideMark/>
+          </w:tcPr>
+          <w:p>
+            <w:pPr>
+              <w:spacing w:after="480" w:line="240" w:lineRule="auto"/>
+              <w:rPr>
+                <w:rFonts w:ascii="Times New Roman" w:eastAsia="Times New Roman" w:hAnsi="Times New Roman" w:cs="Times New Roman"/>
+                <w:sz w:val="24"/>
+                <w:szCs w:val="24"/>
+              </w:rPr>
+            </w:pPr>
+            <w:r>
+              <w:rPr>
+                <w:rFonts w:ascii="Times New Roman" w:eastAsia="Times New Roman" w:hAnsi="Times New Roman" w:cs="Times New Roman"/>
+                <w:b/>
+                <w:bCs/>
+                <w:sz w:val="24"/>
+                <w:szCs w:val="24"/>
+              </w:rPr>
+              <w:t>Paid Amount (₹)</w:t>
+            </w:r>
+          </w:p>
+        </w:tc>
+        <w:tc>
+          <w:tcPr>
+            <w:tcW w:w="0" w:type="auto"/>
+            <w:tcBorders>
+              <w:top w:val="single" w:sz="6" w:space="0" w:color="C4C7C5"/>
+              <w:left w:val="single" w:sz="6" w:space="0" w:color="C4C7C5"/>
+              <w:bottom w:val="single" w:sz="6" w:space="0" w:color="C4C7C5"/>
+              <w:right w:val="single" w:sz="6" w:space="0" w:color="C4C7C5"/>
+            </w:tcBorders>
+            <w:tcMar>
+              <w:top w:w="120" w:type="dxa"/>
+              <w:left w:w="180" w:type="dxa"/>
+              <w:bottom w:w="120" w:type="dxa"/>
+              <w:right w:w="180" w:type="dxa"/>
+            </w:tcMar>
+            <w:vAlign w:val="center"/>
+            <w:hideMark/>
+          </w:tcPr>
+          <w:p>
+            <w:pPr>
+              <w:spacing w:after="480" w:line="240" w:lineRule="auto"/>
+              <w:rPr>
+                <w:rFonts w:ascii="Times New Roman" w:eastAsia="Times New Roman" w:hAnsi="Times New Roman" w:cs="Times New Roman"/>
+                <w:sz w:val="24"/>
+                <w:szCs w:val="24"/>
+              </w:rPr>
+            </w:pPr>
+            <w:r>
+              <w:rPr>
+                <w:rFonts w:ascii="Courier New" w:eastAsia="Times New Roman" w:hAnsi="Courier New" w:cs="Courier New"/>
+                <w:sz w:val="20"/>
+              </w:rPr>
+              <w:t>4500</w:t>
+            </w:r>
+          </w:p>
+        </w:tc>
+        <w:tc>
+          <w:tcPr>
+            <w:tcW w:w="0" w:type="auto"/>
+            <w:tcBorders>
+              <w:top w:val="single" w:sz="6" w:space="0" w:color="C4C7C5"/>
+              <w:left w:val="single" w:sz="6" w:space="0" w:color="C4C7C5"/>
+              <w:bottom w:val="single" w:sz="6" w:space="0" w:color="C4C7C5"/>
+              <w:right w:val="single" w:sz="6" w:space="0" w:color="C4C7C5"/>
+            </w:tcBorders>
+            <w:tcMar>
+              <w:top w:w="120" w:type="dxa"/>
+              <w:left w:w="180" w:type="dxa"/>
+              <w:bottom w:w="120" w:type="dxa"/>
+              <w:right w:w="180" w:type="dxa"/>
+            </w:tcMar>
+            <w:vAlign w:val="center"/>
+            <w:hideMark/>
+          </w:tcPr>
+          <w:p>
+            <w:pPr>
+              <w:spacing w:after="480" w:line="240" w:lineRule="auto"/>
+              <w:rPr>
+                <w:rFonts w:ascii="Times New Roman" w:eastAsia="Times New Roman" w:hAnsi="Times New Roman" w:cs="Times New Roman"/>
+                <w:sz w:val="24"/>
+                <w:szCs w:val="24"/>
+              </w:rPr>
+            </w:pPr>
+            <w:r>
+              <w:rPr>
+                <w:rFonts w:ascii="Courier New" w:eastAsia="Times New Roman" w:hAnsi="Courier New" w:cs="Courier New"/>
+                <w:sz w:val="20"/>
+              </w:rPr>
+              <w:t>5000</w:t>
+            </w:r>
+          </w:p>
+        </w:tc>
+        <w:tc>
+          <w:tcPr>
+            <w:tcW w:w="0" w:type="auto"/>
+            <w:tcBorders>
+              <w:top w:val="single" w:sz="6" w:space="0" w:color="C4C7C5"/>
+              <w:left w:val="single" w:sz="6" w:space="0" w:color="C4C7C5"/>
+              <w:bottom w:val="single" w:sz="6" w:space="0" w:color="C4C7C5"/>
+              <w:right w:val="single" w:sz="6" w:space="0" w:color="C4C7C5"/>
+            </w:tcBorders>
+            <w:tcMar>
+              <w:top w:w="120" w:type="dxa"/>
+              <w:left w:w="180" w:type="dxa"/>
+              <w:bottom w:w="120" w:type="dxa"/>
+              <w:right w:w="180" w:type="dxa"/>
+            </w:tcMar>
+            <w:vAlign w:val="center"/>
+            <w:hideMark/>
+          </w:tcPr>
+          <w:p>
+            <w:pPr>
+              <w:spacing w:after="480" w:line="240" w:lineRule="auto"/>
+              <w:rPr>
+                <w:rFonts w:ascii="Times New Roman" w:eastAsia="Times New Roman" w:hAnsi="Times New Roman" w:cs="Times New Roman"/>
+                <w:sz w:val="24"/>
+                <w:szCs w:val="24"/>
+              </w:rPr>
+            </w:pPr>
+            <w:r>
+              <w:rPr>
+                <w:rFonts w:ascii="Courier New" w:eastAsia="Times New Roman" w:hAnsi="Courier New" w:cs="Courier New"/>
+                <w:sz w:val="20"/>
+              </w:rPr>
+              <w:t>0</w:t>
+            </w:r>
+          </w:p>
+        </w:tc>
+      </w:tr>
+      <w:tr>
+        <w:trPr>
+          <w:tblCellSpacing w:w="15" w:type="dxa"/>
+        </w:trPr>
+        <w:tc>
+          <w:tcPr>
+            <w:tcW w:w="0" w:type="auto"/>
+            <w:tcBorders>
+              <w:top w:val="single" w:sz="6" w:space="0" w:color="C4C7C5"/>
+              <w:left w:val="single" w:sz="6" w:space="0" w:color="C4C7C5"/>
+              <w:bottom w:val="single" w:sz="6" w:space="0" w:color="C4C7C5"/>
+              <w:right w:val="single" w:sz="6" w:space="0" w:color="C4C7C5"/>
+            </w:tcBorders>
+            <w:tcMar>
+              <w:top w:w="120" w:type="dxa"/>
+              <w:left w:w="180" w:type="dxa"/>
+              <w:bottom w:w="120" w:type="dxa"/>
+              <w:right w:w="180" w:type="dxa"/>
+            </w:tcMar>
+            <w:vAlign w:val="center"/>
+            <w:hideMark/>
+          </w:tcPr>
+          <w:p>
+            <w:pPr>
+              <w:spacing w:after="480" w:line="240" w:lineRule="auto"/>
+              <w:rPr>
+                <w:rFonts w:ascii="Times New Roman" w:eastAsia="Times New Roman" w:hAnsi="Times New Roman" w:cs="Times New Roman"/>
+                <w:sz w:val="24"/>
+                <w:szCs w:val="24"/>
+              </w:rPr>
+            </w:pPr>
+            <w:r>
+              <w:rPr>
+                <w:rFonts w:ascii="Times New Roman" w:eastAsia="Times New Roman" w:hAnsi="Times New Roman" w:cs="Times New Roman"/>
+                <w:b/>
+                <w:bCs/>
+                <w:sz w:val="24"/>
+                <w:szCs w:val="24"/>
+              </w:rPr>
+              <w:t>Expected Due Balance</w:t>
+            </w:r>
+          </w:p>
+        </w:tc>
+        <w:tc>
+          <w:tcPr>
+            <w:tcW w:w="0" w:type="auto"/>
+            <w:tcBorders>
+              <w:top w:val="single" w:sz="6" w:space="0" w:color="C4C7C5"/>
+              <w:left w:val="single" w:sz="6" w:space="0" w:color="C4C7C5"/>
+              <w:bottom w:val="single" w:sz="6" w:space="0" w:color="C4C7C5"/>
+              <w:right w:val="single" w:sz="6" w:space="0" w:color="C4C7C5"/>
+            </w:tcBorders>
+            <w:tcMar>
+              <w:top w:w="120" w:type="dxa"/>
+              <w:left w:w="180" w:type="dxa"/>
+              <w:bottom w:w="120" w:type="dxa"/>
+              <w:right w:w="180" w:type="dxa"/>
+            </w:tcMar>
+            <w:vAlign w:val="center"/>
+            <w:hideMark/>
+          </w:tcPr>
+          <w:p>
+            <w:pPr>
+              <w:spacing w:after="480" w:line="240" w:lineRule="auto"/>
+              <w:rPr>
+                <w:rFonts w:ascii="Times New Roman" w:eastAsia="Times New Roman" w:hAnsi="Times New Roman" w:cs="Times New Roman"/>
+                <w:sz w:val="24"/>
+                <w:szCs w:val="24"/>
+              </w:rPr>
+            </w:pPr>
+            <w:r>
+              <w:rPr>
+                <w:rFonts w:ascii="Courier New" w:eastAsia="Times New Roman" w:hAnsi="Courier New" w:cs="Courier New"/>
+                <w:sz w:val="20"/>
+              </w:rPr>
+              <w:t>₹0</w:t>
+            </w:r>
+            <w:r>
+              <w:rPr>
+                <w:rFonts w:ascii="Times New Roman" w:eastAsia="Times New Roman" w:hAnsi="Times New Roman" w:cs="Times New Roman"/>
+                <w:sz w:val="24"/>
+                <w:szCs w:val="24"/>
+              </w:rPr>
+              <w:t xml:space="preserve"> </w:t>
+            </w:r>
+            <w:r>
+              <w:rPr>
+                <w:rFonts w:ascii="Times New Roman" w:eastAsia="Times New Roman" w:hAnsi="Times New Roman" w:cs="Times New Roman"/>
+                <w:i/>
+                <w:iCs/>
+                <w:sz w:val="24"/>
+                <w:szCs w:val="24"/>
+              </w:rPr>
+              <w:t>(Settled Status)</w:t>
+            </w:r>
+          </w:p>
+        </w:tc>
+        <w:tc>
+          <w:tcPr>
+            <w:tcW w:w="0" w:type="auto"/>
+            <w:tcBorders>
+              <w:top w:val="single" w:sz="6" w:space="0" w:color="C4C7C5"/>
+              <w:left w:val="single" w:sz="6" w:space="0" w:color="C4C7C5"/>
+              <w:bottom w:val="single" w:sz="6" w:space="0" w:color="C4C7C5"/>
+              <w:right w:val="single" w:sz="6" w:space="0" w:color="C4C7C5"/>
+            </w:tcBorders>
+            <w:tcMar>
+              <w:top w:w="120" w:type="dxa"/>
+              <w:left w:w="180" w:type="dxa"/>
+              <w:bottom w:w="120" w:type="dxa"/>
+              <w:right w:w="180" w:type="dxa"/>
+            </w:tcMar>
+            <w:vAlign w:val="center"/>
+            <w:hideMark/>
+          </w:tcPr>
+          <w:p>
+            <w:pPr>
+              <w:spacing w:after="480" w:line="240" w:lineRule="auto"/>
+              <w:rPr>
+                <w:rFonts w:ascii="Times New Roman" w:eastAsia="Times New Roman" w:hAnsi="Times New Roman" w:cs="Times New Roman"/>
+                <w:sz w:val="24"/>
+                <w:szCs w:val="24"/>
+              </w:rPr>
+            </w:pPr>
+            <w:r>
+              <w:rPr>
+                <w:rFonts w:ascii="Courier New" w:eastAsia="Times New Roman" w:hAnsi="Courier New" w:cs="Courier New"/>
+                <w:sz w:val="20"/>
+              </w:rPr>
+              <w:t>₹3200</w:t>
+            </w:r>
+            <w:r>
+              <w:rPr>
+                <w:rFonts w:ascii="Times New Roman" w:eastAsia="Times New Roman" w:hAnsi="Times New Roman" w:cs="Times New Roman"/>
+                <w:sz w:val="24"/>
+                <w:szCs w:val="24"/>
+              </w:rPr>
+              <w:t xml:space="preserve"> </w:t>
+            </w:r>
+            <w:r>
+              <w:rPr>
+                <w:rFonts w:ascii="Times New Roman" w:eastAsia="Times New Roman" w:hAnsi="Times New Roman" w:cs="Times New Roman"/>
+                <w:i/>
+                <w:iCs/>
+                <w:sz w:val="24"/>
+                <w:szCs w:val="24"/>
+              </w:rPr>
+              <w:t>(Due Status)</w:t>
+            </w:r>
+          </w:p>
+        </w:tc>
+        <w:tc>
+          <w:tcPr>
+            <w:tcW w:w="0" w:type="auto"/>
+            <w:tcBorders>
+              <w:top w:val="single" w:sz="6" w:space="0" w:color="C4C7C5"/>
+              <w:left w:val="single" w:sz="6" w:space="0" w:color="C4C7C5"/>
+              <w:bottom w:val="single" w:sz="6" w:space="0" w:color="C4C7C5"/>
+              <w:right w:val="single" w:sz="6" w:space="0" w:color="C4C7C5"/>
+            </w:tcBorders>
+            <w:tcMar>
+              <w:top w:w="120" w:type="dxa"/>
+              <w:left w:w="180" w:type="dxa"/>
+              <w:bottom w:w="120" w:type="dxa"/>
+              <w:right w:w="180" w:type="dxa"/>
+            </w:tcMar>
+            <w:vAlign w:val="center"/>
+            <w:hideMark/>
+          </w:tcPr>
+          <w:p>
+            <w:pPr>
+              <w:spacing w:after="480" w:line="240" w:lineRule="auto"/>
+              <w:rPr>
+                <w:rFonts w:ascii="Times New Roman" w:eastAsia="Times New Roman" w:hAnsi="Times New Roman" w:cs="Times New Roman"/>
+                <w:sz w:val="24"/>
+                <w:szCs w:val="24"/>
+              </w:rPr>
+            </w:pPr>
+            <w:r>
+              <w:rPr>
+                <w:rFonts w:ascii="Courier New" w:eastAsia="Times New Roman" w:hAnsi="Courier New" w:cs="Courier New"/>
+                <w:sz w:val="20"/>
+              </w:rPr>
+              <w:t>₹15000</w:t>
+            </w:r>
+            <w:r>
+              <w:rPr>
+                <w:rFonts w:ascii="Times New Roman" w:eastAsia="Times New Roman" w:hAnsi="Times New Roman" w:cs="Times New Roman"/>
+                <w:sz w:val="24"/>
+                <w:szCs w:val="24"/>
+              </w:rPr>
+              <w:t xml:space="preserve"> </w:t>
+            </w:r>
+            <w:r>
+              <w:rPr>
+                <w:rFonts w:ascii="Times New Roman" w:eastAsia="Times New Roman" w:hAnsi="Times New Roman" w:cs="Times New Roman"/>
+                <w:i/>
+                <w:iCs/>
+                <w:sz w:val="24"/>
+                <w:szCs w:val="24"/>
+              </w:rPr>
+              <w:t>(Due Status)</w:t>
             </w:r>
           </w:p>
         </w:tc>

</xml_diff>